<commit_message>
Replace lesson plan documents
</commit_message>
<xml_diff>
--- a/documents/en.docx
+++ b/documents/en.docx
@@ -4411,6 +4411,3238 @@
     <w:p>
       <w:pPr>
         <w:pStyle w:val="Titre1"/>
+        <w:rPr>
+          <w:lang w:val="en-US"/>
+        </w:rPr>
+      </w:pPr>
+      <w:r>
+        <w:rPr>
+          <w:b/>
+          <w:bCs/>
+          <w:lang w:val="en-US"/>
+        </w:rPr>
+        <w:lastRenderedPageBreak/>
+        <w:t>Morocco's Coach and Squad — 2026 World Cup</w:t>
+      </w:r>
+    </w:p>
+    <w:p>
+      <w:pPr>
+        <w:bidi/>
+        <w:spacing w:after="120"/>
+        <w:jc w:val="right"/>
+        <w:rPr>
+          <w:lang w:val="en-US"/>
+        </w:rPr>
+      </w:pPr>
+      <w:r>
+        <w:rPr>
+          <w:rFonts w:ascii="Traditional Arabic" w:eastAsia="Traditional Arabic" w:hAnsi="Traditional Arabic" w:cs="Traditional Arabic"/>
+          <w:b/>
+          <w:bCs/>
+          <w:sz w:val="26"/>
+          <w:szCs w:val="26"/>
+          <w:rtl/>
+        </w:rPr>
+        <w:t>مدرب المنتخب المغربي وقائمته — كأس العالم 2026</w:t>
+      </w:r>
+    </w:p>
+    <w:p>
+      <w:pPr>
+        <w:spacing w:after="240"/>
+        <w:rPr>
+          <w:lang w:val="en-US"/>
+        </w:rPr>
+      </w:pPr>
+      <w:r>
+        <w:rPr>
+          <w:lang w:val="en-US"/>
+        </w:rPr>
+        <w:t xml:space="preserve">This section introduces the students to the people behind Morocco's 2026 World Cup campaign: the head coach and the 26 players of the final squad. </w:t>
+      </w:r>
+    </w:p>
+    <w:p>
+      <w:pPr>
+        <w:pStyle w:val="Titre2"/>
+        <w:rPr>
+          <w:lang w:val="en-US"/>
+        </w:rPr>
+      </w:pPr>
+      <w:r>
+        <w:rPr>
+          <w:b/>
+          <w:bCs/>
+          <w:lang w:val="en-US"/>
+        </w:rPr>
+        <w:t>The Head Coach</w:t>
+      </w:r>
+    </w:p>
+    <w:p>
+      <w:pPr>
+        <w:bidi/>
+        <w:spacing w:after="120"/>
+        <w:jc w:val="right"/>
+        <w:rPr>
+          <w:lang w:val="en-US"/>
+        </w:rPr>
+      </w:pPr>
+      <w:r>
+        <w:rPr>
+          <w:rFonts w:ascii="Traditional Arabic" w:eastAsia="Traditional Arabic" w:hAnsi="Traditional Arabic" w:cs="Traditional Arabic"/>
+          <w:sz w:val="26"/>
+          <w:szCs w:val="26"/>
+          <w:rtl/>
+        </w:rPr>
+        <w:t>المدرِّب</w:t>
+      </w:r>
+    </w:p>
+    <w:p>
+      <w:pPr>
+        <w:spacing w:after="240"/>
+        <w:rPr>
+          <w:lang w:val="en-US"/>
+        </w:rPr>
+      </w:pPr>
+      <w:r>
+        <w:rPr>
+          <w:lang w:val="en-US"/>
+        </w:rPr>
+        <w:t xml:space="preserve">Mohamed </w:t>
+      </w:r>
+      <w:proofErr w:type="spellStart"/>
+      <w:r>
+        <w:rPr>
+          <w:lang w:val="en-US"/>
+        </w:rPr>
+        <w:t>Ouahbi</w:t>
+      </w:r>
+      <w:proofErr w:type="spellEnd"/>
+      <w:r>
+        <w:rPr>
+          <w:lang w:val="en-US"/>
+        </w:rPr>
+        <w:t xml:space="preserve"> is the head coach of the Moroccan national team. Born on 7 September 1976 in Schaerbeek, Belgium, to a Moroccan family from the </w:t>
+      </w:r>
+      <w:proofErr w:type="spellStart"/>
+      <w:r>
+        <w:rPr>
+          <w:lang w:val="en-US"/>
+        </w:rPr>
+        <w:t>Nador</w:t>
+      </w:r>
+      <w:proofErr w:type="spellEnd"/>
+      <w:r>
+        <w:rPr>
+          <w:lang w:val="en-US"/>
+        </w:rPr>
+        <w:t xml:space="preserve"> region, he built his coaching career at Anderlecht (2003–2021), where he trained young players including </w:t>
+      </w:r>
+      <w:proofErr w:type="spellStart"/>
+      <w:r>
+        <w:rPr>
+          <w:lang w:val="en-US"/>
+        </w:rPr>
+        <w:t>Youri</w:t>
+      </w:r>
+      <w:proofErr w:type="spellEnd"/>
+      <w:r>
+        <w:rPr>
+          <w:lang w:val="en-US"/>
+        </w:rPr>
+        <w:t xml:space="preserve"> </w:t>
+      </w:r>
+      <w:proofErr w:type="spellStart"/>
+      <w:r>
+        <w:rPr>
+          <w:lang w:val="en-US"/>
+        </w:rPr>
+        <w:t>Tielemans</w:t>
+      </w:r>
+      <w:proofErr w:type="spellEnd"/>
+      <w:r>
+        <w:rPr>
+          <w:lang w:val="en-US"/>
+        </w:rPr>
+        <w:t xml:space="preserve"> and Adnan Januzaj. He led Morocco's U-20 team from 2022, winning the 2025 FIFA U-20 World Cup in Chile with a 2-0 victory over Argentina in the final. In March 2026, he was appointed head coach of the senior national team, succeeding Walid </w:t>
+      </w:r>
+      <w:proofErr w:type="spellStart"/>
+      <w:r>
+        <w:rPr>
+          <w:lang w:val="en-US"/>
+        </w:rPr>
+        <w:t>Regragui</w:t>
+      </w:r>
+      <w:proofErr w:type="spellEnd"/>
+      <w:r>
+        <w:rPr>
+          <w:lang w:val="en-US"/>
+        </w:rPr>
+        <w:t>, who had led Morocco to the historic 2022 World Cup semifinal.</w:t>
+      </w:r>
+    </w:p>
+    <w:p>
+      <w:pPr>
+        <w:pStyle w:val="Titre2"/>
+      </w:pPr>
+      <w:r>
+        <w:rPr>
+          <w:b/>
+          <w:bCs/>
+        </w:rPr>
+        <w:t xml:space="preserve">Key </w:t>
+      </w:r>
+      <w:proofErr w:type="spellStart"/>
+      <w:r>
+        <w:rPr>
+          <w:b/>
+          <w:bCs/>
+        </w:rPr>
+        <w:t>Facts</w:t>
+      </w:r>
+      <w:proofErr w:type="spellEnd"/>
+      <w:r>
+        <w:rPr>
+          <w:b/>
+          <w:bCs/>
+        </w:rPr>
+        <w:t xml:space="preserve"> for </w:t>
+      </w:r>
+      <w:proofErr w:type="spellStart"/>
+      <w:r>
+        <w:rPr>
+          <w:b/>
+          <w:bCs/>
+        </w:rPr>
+        <w:t>Arabic</w:t>
+      </w:r>
+      <w:proofErr w:type="spellEnd"/>
+      <w:r>
+        <w:rPr>
+          <w:b/>
+          <w:bCs/>
+        </w:rPr>
+        <w:t xml:space="preserve"> </w:t>
+      </w:r>
+      <w:proofErr w:type="spellStart"/>
+      <w:r>
+        <w:rPr>
+          <w:b/>
+          <w:bCs/>
+        </w:rPr>
+        <w:t>Learners</w:t>
+      </w:r>
+      <w:proofErr w:type="spellEnd"/>
+    </w:p>
+    <w:p>
+      <w:pPr>
+        <w:pStyle w:val="Paragraphedeliste"/>
+        <w:numPr>
+          <w:ilvl w:val="0"/>
+          <w:numId w:val="2"/>
+        </w:numPr>
+        <w:rPr>
+          <w:lang w:val="en-US"/>
+        </w:rPr>
+      </w:pPr>
+      <w:r>
+        <w:rPr>
+          <w:lang w:val="en-US"/>
+        </w:rPr>
+        <w:t xml:space="preserve">Morocco is nicknamed "the Atlas Lions" — </w:t>
+      </w:r>
+      <w:proofErr w:type="spellStart"/>
+      <w:r>
+        <w:t>أُسود</w:t>
+      </w:r>
+      <w:proofErr w:type="spellEnd"/>
+      <w:r>
+        <w:rPr>
+          <w:lang w:val="en-US"/>
+        </w:rPr>
+        <w:t xml:space="preserve"> </w:t>
+      </w:r>
+      <w:proofErr w:type="spellStart"/>
+      <w:r>
+        <w:t>الأطلس</w:t>
+      </w:r>
+      <w:proofErr w:type="spellEnd"/>
+      <w:r>
+        <w:rPr>
+          <w:lang w:val="en-US"/>
+        </w:rPr>
+        <w:t xml:space="preserve"> — after the Atlas Mountains.</w:t>
+      </w:r>
+    </w:p>
+    <w:p>
+      <w:pPr>
+        <w:pStyle w:val="Paragraphedeliste"/>
+        <w:numPr>
+          <w:ilvl w:val="0"/>
+          <w:numId w:val="2"/>
+        </w:numPr>
+        <w:rPr>
+          <w:lang w:val="en-US"/>
+        </w:rPr>
+      </w:pPr>
+      <w:r>
+        <w:rPr>
+          <w:lang w:val="en-US"/>
+        </w:rPr>
+        <w:t xml:space="preserve">The captain of the squad is </w:t>
+      </w:r>
+      <w:proofErr w:type="spellStart"/>
+      <w:r>
+        <w:rPr>
+          <w:lang w:val="en-US"/>
+        </w:rPr>
+        <w:t>Achraf</w:t>
+      </w:r>
+      <w:proofErr w:type="spellEnd"/>
+      <w:r>
+        <w:rPr>
+          <w:lang w:val="en-US"/>
+        </w:rPr>
+        <w:t xml:space="preserve"> Hakimi (</w:t>
+      </w:r>
+      <w:proofErr w:type="spellStart"/>
+      <w:r>
+        <w:t>أشرف</w:t>
+      </w:r>
+      <w:proofErr w:type="spellEnd"/>
+      <w:r>
+        <w:rPr>
+          <w:lang w:val="en-US"/>
+        </w:rPr>
+        <w:t xml:space="preserve"> </w:t>
+      </w:r>
+      <w:proofErr w:type="spellStart"/>
+      <w:r>
+        <w:t>حكيمي</w:t>
+      </w:r>
+      <w:proofErr w:type="spellEnd"/>
+      <w:r>
+        <w:rPr>
+          <w:lang w:val="en-US"/>
+        </w:rPr>
+        <w:t>), who plays for Paris Saint-Germain.</w:t>
+      </w:r>
+    </w:p>
+    <w:p>
+      <w:pPr>
+        <w:pStyle w:val="Paragraphedeliste"/>
+        <w:numPr>
+          <w:ilvl w:val="0"/>
+          <w:numId w:val="2"/>
+        </w:numPr>
+        <w:rPr>
+          <w:lang w:val="en-US"/>
+        </w:rPr>
+      </w:pPr>
+      <w:r>
+        <w:rPr>
+          <w:lang w:val="en-US"/>
+        </w:rPr>
+        <w:t xml:space="preserve">Several veterans of Morocco's 2022 semifinal run remain in the squad, including goalkeeper Yassine </w:t>
+      </w:r>
+      <w:proofErr w:type="spellStart"/>
+      <w:r>
+        <w:rPr>
+          <w:lang w:val="en-US"/>
+        </w:rPr>
+        <w:t>Bounou</w:t>
+      </w:r>
+      <w:proofErr w:type="spellEnd"/>
+      <w:r>
+        <w:rPr>
+          <w:lang w:val="en-US"/>
+        </w:rPr>
+        <w:t xml:space="preserve"> (</w:t>
+      </w:r>
+      <w:proofErr w:type="spellStart"/>
+      <w:r>
+        <w:t>يسين</w:t>
+      </w:r>
+      <w:proofErr w:type="spellEnd"/>
+      <w:r>
+        <w:rPr>
+          <w:lang w:val="en-US"/>
+        </w:rPr>
+        <w:t xml:space="preserve"> </w:t>
+      </w:r>
+      <w:proofErr w:type="spellStart"/>
+      <w:r>
+        <w:t>بونو</w:t>
+      </w:r>
+      <w:proofErr w:type="spellEnd"/>
+      <w:r>
+        <w:rPr>
+          <w:lang w:val="en-US"/>
+        </w:rPr>
+        <w:t xml:space="preserve">) and midfielder </w:t>
+      </w:r>
+      <w:proofErr w:type="spellStart"/>
+      <w:r>
+        <w:rPr>
+          <w:lang w:val="en-US"/>
+        </w:rPr>
+        <w:t>Sofyan</w:t>
+      </w:r>
+      <w:proofErr w:type="spellEnd"/>
+      <w:r>
+        <w:rPr>
+          <w:lang w:val="en-US"/>
+        </w:rPr>
+        <w:t xml:space="preserve"> Amrabat (</w:t>
+      </w:r>
+      <w:proofErr w:type="spellStart"/>
+      <w:r>
+        <w:t>سفيان</w:t>
+      </w:r>
+      <w:proofErr w:type="spellEnd"/>
+      <w:r>
+        <w:rPr>
+          <w:lang w:val="en-US"/>
+        </w:rPr>
+        <w:t xml:space="preserve"> </w:t>
+      </w:r>
+      <w:proofErr w:type="spellStart"/>
+      <w:r>
+        <w:t>أمرابط</w:t>
+      </w:r>
+      <w:proofErr w:type="spellEnd"/>
+      <w:r>
+        <w:rPr>
+          <w:lang w:val="en-US"/>
+        </w:rPr>
+        <w:t>).</w:t>
+      </w:r>
+    </w:p>
+    <w:p>
+      <w:pPr>
+        <w:pStyle w:val="Paragraphedeliste"/>
+        <w:numPr>
+          <w:ilvl w:val="0"/>
+          <w:numId w:val="2"/>
+        </w:numPr>
+        <w:rPr>
+          <w:lang w:val="en-US"/>
+        </w:rPr>
+      </w:pPr>
+      <w:r>
+        <w:rPr>
+          <w:lang w:val="en-US"/>
+        </w:rPr>
+        <w:t>Most players are based in European clubs (France, England, Spain, Germany, Netherlands, Belgium, Italy) — a good opportunity to review country names and nationalities in Arabic.</w:t>
+      </w:r>
+    </w:p>
+    <w:p>
+      <w:pPr>
+        <w:pStyle w:val="Paragraphedeliste"/>
+        <w:numPr>
+          <w:ilvl w:val="0"/>
+          <w:numId w:val="2"/>
+        </w:numPr>
+        <w:rPr>
+          <w:lang w:val="en-US"/>
+        </w:rPr>
+      </w:pPr>
+      <w:r>
+        <w:rPr>
+          <w:lang w:val="en-US"/>
+        </w:rPr>
+        <w:t xml:space="preserve">Two late changes were made to the squad shortly before the tournament: defender </w:t>
+      </w:r>
+      <w:proofErr w:type="spellStart"/>
+      <w:r>
+        <w:rPr>
+          <w:lang w:val="en-US"/>
+        </w:rPr>
+        <w:t>Marwane</w:t>
+      </w:r>
+      <w:proofErr w:type="spellEnd"/>
+      <w:r>
+        <w:rPr>
+          <w:lang w:val="en-US"/>
+        </w:rPr>
+        <w:t xml:space="preserve"> </w:t>
+      </w:r>
+      <w:proofErr w:type="spellStart"/>
+      <w:r>
+        <w:rPr>
+          <w:lang w:val="en-US"/>
+        </w:rPr>
+        <w:t>Saâdane</w:t>
+      </w:r>
+      <w:proofErr w:type="spellEnd"/>
+      <w:r>
+        <w:rPr>
+          <w:lang w:val="en-US"/>
+        </w:rPr>
+        <w:t xml:space="preserve"> replaced the injured Nayef </w:t>
+      </w:r>
+      <w:proofErr w:type="spellStart"/>
+      <w:r>
+        <w:rPr>
+          <w:lang w:val="en-US"/>
+        </w:rPr>
+        <w:t>Aguerd</w:t>
+      </w:r>
+      <w:proofErr w:type="spellEnd"/>
+      <w:r>
+        <w:rPr>
+          <w:lang w:val="en-US"/>
+        </w:rPr>
+        <w:t xml:space="preserve">, and forward Amine </w:t>
+      </w:r>
+      <w:proofErr w:type="spellStart"/>
+      <w:r>
+        <w:rPr>
+          <w:lang w:val="en-US"/>
+        </w:rPr>
+        <w:t>Sbaï</w:t>
+      </w:r>
+      <w:proofErr w:type="spellEnd"/>
+      <w:r>
+        <w:rPr>
+          <w:lang w:val="en-US"/>
+        </w:rPr>
+        <w:t xml:space="preserve"> replaced the injured </w:t>
+      </w:r>
+      <w:proofErr w:type="spellStart"/>
+      <w:r>
+        <w:rPr>
+          <w:lang w:val="en-US"/>
+        </w:rPr>
+        <w:t>Abdessamad</w:t>
+      </w:r>
+      <w:proofErr w:type="spellEnd"/>
+      <w:r>
+        <w:rPr>
+          <w:lang w:val="en-US"/>
+        </w:rPr>
+        <w:t xml:space="preserve"> </w:t>
+      </w:r>
+      <w:proofErr w:type="spellStart"/>
+      <w:r>
+        <w:rPr>
+          <w:lang w:val="en-US"/>
+        </w:rPr>
+        <w:t>Ezzalzouli</w:t>
+      </w:r>
+      <w:proofErr w:type="spellEnd"/>
+      <w:r>
+        <w:rPr>
+          <w:lang w:val="en-US"/>
+        </w:rPr>
+        <w:t xml:space="preserve">. </w:t>
+      </w:r>
+      <w:r>
+        <w:rPr>
+          <w:lang w:val="en-US"/>
+        </w:rPr>
+        <w:t xml:space="preserve">The table below reflects Morocco's final 26-player squad. El Mehdi Al </w:t>
+      </w:r>
+      <w:proofErr w:type="spellStart"/>
+      <w:r>
+        <w:rPr>
+          <w:lang w:val="en-US"/>
+        </w:rPr>
+        <w:t>Harrar</w:t>
+      </w:r>
+      <w:proofErr w:type="spellEnd"/>
+      <w:r>
+        <w:rPr>
+          <w:lang w:val="en-US"/>
+        </w:rPr>
+        <w:t xml:space="preserve"> was also named as a reserve goalkeeper.</w:t>
+      </w:r>
+    </w:p>
+    <w:p>
+      <w:pPr>
+        <w:pStyle w:val="Titre2"/>
+        <w:spacing w:before="240"/>
+      </w:pPr>
+      <w:proofErr w:type="spellStart"/>
+      <w:r>
+        <w:rPr>
+          <w:b/>
+          <w:bCs/>
+        </w:rPr>
+        <w:t>Vocabulary</w:t>
+      </w:r>
+      <w:proofErr w:type="spellEnd"/>
+    </w:p>
+    <w:tbl>
+      <w:tblPr>
+        <w:tblW w:w="9000" w:type="dxa"/>
+        <w:tblBorders>
+          <w:top w:val="single" w:sz="4" w:space="0" w:color="auto"/>
+          <w:left w:val="single" w:sz="4" w:space="0" w:color="auto"/>
+          <w:bottom w:val="single" w:sz="4" w:space="0" w:color="auto"/>
+          <w:right w:val="single" w:sz="4" w:space="0" w:color="auto"/>
+          <w:insideH w:val="single" w:sz="4" w:space="0" w:color="auto"/>
+          <w:insideV w:val="single" w:sz="4" w:space="0" w:color="auto"/>
+        </w:tblBorders>
+        <w:tblCellMar>
+          <w:left w:w="10" w:type="dxa"/>
+          <w:right w:w="10" w:type="dxa"/>
+        </w:tblCellMar>
+        <w:tblLook w:val="04A0" w:firstRow="1" w:lastRow="0" w:firstColumn="1" w:lastColumn="0" w:noHBand="0" w:noVBand="1"/>
+      </w:tblPr>
+      <w:tblGrid>
+        <w:gridCol w:w="4500"/>
+        <w:gridCol w:w="4500"/>
+      </w:tblGrid>
+      <w:tr>
+        <w:tblPrEx>
+          <w:tblCellMar>
+            <w:top w:w="0" w:type="dxa"/>
+            <w:bottom w:w="0" w:type="dxa"/>
+          </w:tblCellMar>
+        </w:tblPrEx>
+        <w:tc>
+          <w:tcPr>
+            <w:tcW w:w="4500" w:type="dxa"/>
+            <w:shd w:val="clear" w:color="auto" w:fill="EFEFEF"/>
+            <w:vAlign w:val="center"/>
+          </w:tcPr>
+          <w:p>
+            <w:r>
+              <w:rPr>
+                <w:b/>
+                <w:bCs/>
+              </w:rPr>
+              <w:t>English</w:t>
+            </w:r>
+          </w:p>
+        </w:tc>
+        <w:tc>
+          <w:tcPr>
+            <w:tcW w:w="4500" w:type="dxa"/>
+            <w:shd w:val="clear" w:color="auto" w:fill="EFEFEF"/>
+            <w:vAlign w:val="center"/>
+          </w:tcPr>
+          <w:p>
+            <w:proofErr w:type="spellStart"/>
+            <w:r>
+              <w:rPr>
+                <w:b/>
+                <w:bCs/>
+              </w:rPr>
+              <w:t>Arabic</w:t>
+            </w:r>
+            <w:proofErr w:type="spellEnd"/>
+          </w:p>
+        </w:tc>
+      </w:tr>
+      <w:tr>
+        <w:tblPrEx>
+          <w:tblCellMar>
+            <w:top w:w="0" w:type="dxa"/>
+            <w:bottom w:w="0" w:type="dxa"/>
+          </w:tblCellMar>
+        </w:tblPrEx>
+        <w:tc>
+          <w:tcPr>
+            <w:tcW w:w="4500" w:type="dxa"/>
+            <w:vAlign w:val="center"/>
+          </w:tcPr>
+          <w:p>
+            <w:r>
+              <w:t>Head coach / manager</w:t>
+            </w:r>
+          </w:p>
+        </w:tc>
+        <w:tc>
+          <w:tcPr>
+            <w:tcW w:w="4500" w:type="dxa"/>
+            <w:vAlign w:val="center"/>
+          </w:tcPr>
+          <w:p>
+            <w:pPr>
+              <w:bidi/>
+              <w:jc w:val="right"/>
+            </w:pPr>
+            <w:r>
+              <w:rPr>
+                <w:rFonts w:ascii="Traditional Arabic" w:eastAsia="Traditional Arabic" w:hAnsi="Traditional Arabic" w:cs="Traditional Arabic"/>
+                <w:sz w:val="26"/>
+                <w:szCs w:val="26"/>
+                <w:rtl/>
+              </w:rPr>
+              <w:t>مدرِّب</w:t>
+            </w:r>
+          </w:p>
+        </w:tc>
+      </w:tr>
+      <w:tr>
+        <w:tblPrEx>
+          <w:tblCellMar>
+            <w:top w:w="0" w:type="dxa"/>
+            <w:bottom w:w="0" w:type="dxa"/>
+          </w:tblCellMar>
+        </w:tblPrEx>
+        <w:tc>
+          <w:tcPr>
+            <w:tcW w:w="4500" w:type="dxa"/>
+            <w:vAlign w:val="center"/>
+          </w:tcPr>
+          <w:p>
+            <w:r>
+              <w:t xml:space="preserve">National team </w:t>
+            </w:r>
+            <w:proofErr w:type="spellStart"/>
+            <w:r>
+              <w:t>squad</w:t>
+            </w:r>
+            <w:proofErr w:type="spellEnd"/>
+            <w:r>
+              <w:t xml:space="preserve"> / </w:t>
+            </w:r>
+            <w:proofErr w:type="spellStart"/>
+            <w:r>
+              <w:t>roster</w:t>
+            </w:r>
+            <w:proofErr w:type="spellEnd"/>
+          </w:p>
+        </w:tc>
+        <w:tc>
+          <w:tcPr>
+            <w:tcW w:w="4500" w:type="dxa"/>
+            <w:vAlign w:val="center"/>
+          </w:tcPr>
+          <w:p>
+            <w:pPr>
+              <w:bidi/>
+              <w:jc w:val="right"/>
+            </w:pPr>
+            <w:r>
+              <w:rPr>
+                <w:rFonts w:ascii="Traditional Arabic" w:eastAsia="Traditional Arabic" w:hAnsi="Traditional Arabic" w:cs="Traditional Arabic"/>
+                <w:sz w:val="26"/>
+                <w:szCs w:val="26"/>
+                <w:rtl/>
+              </w:rPr>
+              <w:t>قائمة المنتخب</w:t>
+            </w:r>
+          </w:p>
+        </w:tc>
+      </w:tr>
+      <w:tr>
+        <w:tblPrEx>
+          <w:tblCellMar>
+            <w:top w:w="0" w:type="dxa"/>
+            <w:bottom w:w="0" w:type="dxa"/>
+          </w:tblCellMar>
+        </w:tblPrEx>
+        <w:tc>
+          <w:tcPr>
+            <w:tcW w:w="4500" w:type="dxa"/>
+            <w:vAlign w:val="center"/>
+          </w:tcPr>
+          <w:p>
+            <w:proofErr w:type="spellStart"/>
+            <w:r>
+              <w:t>Captain</w:t>
+            </w:r>
+            <w:proofErr w:type="spellEnd"/>
+            <w:r>
+              <w:t xml:space="preserve"> (of the team)</w:t>
+            </w:r>
+          </w:p>
+        </w:tc>
+        <w:tc>
+          <w:tcPr>
+            <w:tcW w:w="4500" w:type="dxa"/>
+            <w:vAlign w:val="center"/>
+          </w:tcPr>
+          <w:p>
+            <w:pPr>
+              <w:bidi/>
+              <w:jc w:val="right"/>
+            </w:pPr>
+            <w:r>
+              <w:rPr>
+                <w:rFonts w:ascii="Traditional Arabic" w:eastAsia="Traditional Arabic" w:hAnsi="Traditional Arabic" w:cs="Traditional Arabic"/>
+                <w:sz w:val="26"/>
+                <w:szCs w:val="26"/>
+                <w:rtl/>
+              </w:rPr>
+              <w:t>قائد الفريق</w:t>
+            </w:r>
+          </w:p>
+        </w:tc>
+      </w:tr>
+      <w:tr>
+        <w:tblPrEx>
+          <w:tblCellMar>
+            <w:top w:w="0" w:type="dxa"/>
+            <w:bottom w:w="0" w:type="dxa"/>
+          </w:tblCellMar>
+        </w:tblPrEx>
+        <w:tc>
+          <w:tcPr>
+            <w:tcW w:w="4500" w:type="dxa"/>
+            <w:vAlign w:val="center"/>
+          </w:tcPr>
+          <w:p>
+            <w:proofErr w:type="spellStart"/>
+            <w:r>
+              <w:t>Goalkeeper</w:t>
+            </w:r>
+            <w:proofErr w:type="spellEnd"/>
+          </w:p>
+        </w:tc>
+        <w:tc>
+          <w:tcPr>
+            <w:tcW w:w="4500" w:type="dxa"/>
+            <w:vAlign w:val="center"/>
+          </w:tcPr>
+          <w:p>
+            <w:pPr>
+              <w:bidi/>
+              <w:jc w:val="right"/>
+            </w:pPr>
+            <w:r>
+              <w:rPr>
+                <w:rFonts w:ascii="Traditional Arabic" w:eastAsia="Traditional Arabic" w:hAnsi="Traditional Arabic" w:cs="Traditional Arabic"/>
+                <w:sz w:val="26"/>
+                <w:szCs w:val="26"/>
+                <w:rtl/>
+              </w:rPr>
+              <w:t>حارس مرمى</w:t>
+            </w:r>
+          </w:p>
+        </w:tc>
+      </w:tr>
+      <w:tr>
+        <w:tblPrEx>
+          <w:tblCellMar>
+            <w:top w:w="0" w:type="dxa"/>
+            <w:bottom w:w="0" w:type="dxa"/>
+          </w:tblCellMar>
+        </w:tblPrEx>
+        <w:tc>
+          <w:tcPr>
+            <w:tcW w:w="4500" w:type="dxa"/>
+            <w:vAlign w:val="center"/>
+          </w:tcPr>
+          <w:p>
+            <w:r>
+              <w:t>Defender</w:t>
+            </w:r>
+          </w:p>
+        </w:tc>
+        <w:tc>
+          <w:tcPr>
+            <w:tcW w:w="4500" w:type="dxa"/>
+            <w:vAlign w:val="center"/>
+          </w:tcPr>
+          <w:p>
+            <w:pPr>
+              <w:bidi/>
+              <w:jc w:val="right"/>
+            </w:pPr>
+            <w:r>
+              <w:rPr>
+                <w:rFonts w:ascii="Traditional Arabic" w:eastAsia="Traditional Arabic" w:hAnsi="Traditional Arabic" w:cs="Traditional Arabic"/>
+                <w:sz w:val="26"/>
+                <w:szCs w:val="26"/>
+                <w:rtl/>
+              </w:rPr>
+              <w:t>مدافع</w:t>
+            </w:r>
+          </w:p>
+        </w:tc>
+      </w:tr>
+      <w:tr>
+        <w:tblPrEx>
+          <w:tblCellMar>
+            <w:top w:w="0" w:type="dxa"/>
+            <w:bottom w:w="0" w:type="dxa"/>
+          </w:tblCellMar>
+        </w:tblPrEx>
+        <w:tc>
+          <w:tcPr>
+            <w:tcW w:w="4500" w:type="dxa"/>
+            <w:vAlign w:val="center"/>
+          </w:tcPr>
+          <w:p>
+            <w:proofErr w:type="spellStart"/>
+            <w:r>
+              <w:t>Midfielder</w:t>
+            </w:r>
+            <w:proofErr w:type="spellEnd"/>
+          </w:p>
+        </w:tc>
+        <w:tc>
+          <w:tcPr>
+            <w:tcW w:w="4500" w:type="dxa"/>
+            <w:vAlign w:val="center"/>
+          </w:tcPr>
+          <w:p>
+            <w:pPr>
+              <w:bidi/>
+              <w:jc w:val="right"/>
+            </w:pPr>
+            <w:r>
+              <w:rPr>
+                <w:rFonts w:ascii="Traditional Arabic" w:eastAsia="Traditional Arabic" w:hAnsi="Traditional Arabic" w:cs="Traditional Arabic"/>
+                <w:sz w:val="26"/>
+                <w:szCs w:val="26"/>
+                <w:rtl/>
+              </w:rPr>
+              <w:t>لاعب وسط</w:t>
+            </w:r>
+          </w:p>
+        </w:tc>
+      </w:tr>
+      <w:tr>
+        <w:tblPrEx>
+          <w:tblCellMar>
+            <w:top w:w="0" w:type="dxa"/>
+            <w:bottom w:w="0" w:type="dxa"/>
+          </w:tblCellMar>
+        </w:tblPrEx>
+        <w:tc>
+          <w:tcPr>
+            <w:tcW w:w="4500" w:type="dxa"/>
+            <w:vAlign w:val="center"/>
+          </w:tcPr>
+          <w:p>
+            <w:proofErr w:type="spellStart"/>
+            <w:r>
+              <w:t>Forward</w:t>
+            </w:r>
+            <w:proofErr w:type="spellEnd"/>
+            <w:r>
+              <w:t xml:space="preserve"> / </w:t>
+            </w:r>
+            <w:proofErr w:type="spellStart"/>
+            <w:r>
+              <w:t>attacker</w:t>
+            </w:r>
+            <w:proofErr w:type="spellEnd"/>
+          </w:p>
+        </w:tc>
+        <w:tc>
+          <w:tcPr>
+            <w:tcW w:w="4500" w:type="dxa"/>
+            <w:vAlign w:val="center"/>
+          </w:tcPr>
+          <w:p>
+            <w:pPr>
+              <w:bidi/>
+              <w:jc w:val="right"/>
+            </w:pPr>
+            <w:r>
+              <w:rPr>
+                <w:rFonts w:ascii="Traditional Arabic" w:eastAsia="Traditional Arabic" w:hAnsi="Traditional Arabic" w:cs="Traditional Arabic"/>
+                <w:sz w:val="26"/>
+                <w:szCs w:val="26"/>
+                <w:rtl/>
+              </w:rPr>
+              <w:t>مهاجم</w:t>
+            </w:r>
+          </w:p>
+        </w:tc>
+      </w:tr>
+      <w:tr>
+        <w:tblPrEx>
+          <w:tblCellMar>
+            <w:top w:w="0" w:type="dxa"/>
+            <w:bottom w:w="0" w:type="dxa"/>
+          </w:tblCellMar>
+        </w:tblPrEx>
+        <w:tc>
+          <w:tcPr>
+            <w:tcW w:w="4500" w:type="dxa"/>
+            <w:vAlign w:val="center"/>
+          </w:tcPr>
+          <w:p>
+            <w:r>
+              <w:t>Substitute (</w:t>
+            </w:r>
+            <w:proofErr w:type="spellStart"/>
+            <w:r>
+              <w:t>player</w:t>
+            </w:r>
+            <w:proofErr w:type="spellEnd"/>
+            <w:r>
+              <w:t>)</w:t>
+            </w:r>
+          </w:p>
+        </w:tc>
+        <w:tc>
+          <w:tcPr>
+            <w:tcW w:w="4500" w:type="dxa"/>
+            <w:vAlign w:val="center"/>
+          </w:tcPr>
+          <w:p>
+            <w:pPr>
+              <w:bidi/>
+              <w:jc w:val="right"/>
+            </w:pPr>
+            <w:r>
+              <w:rPr>
+                <w:rFonts w:ascii="Traditional Arabic" w:eastAsia="Traditional Arabic" w:hAnsi="Traditional Arabic" w:cs="Traditional Arabic"/>
+                <w:sz w:val="26"/>
+                <w:szCs w:val="26"/>
+                <w:rtl/>
+              </w:rPr>
+              <w:t>لاعب بديل</w:t>
+            </w:r>
+          </w:p>
+        </w:tc>
+      </w:tr>
+      <w:tr>
+        <w:tblPrEx>
+          <w:tblCellMar>
+            <w:top w:w="0" w:type="dxa"/>
+            <w:bottom w:w="0" w:type="dxa"/>
+          </w:tblCellMar>
+        </w:tblPrEx>
+        <w:tc>
+          <w:tcPr>
+            <w:tcW w:w="4500" w:type="dxa"/>
+            <w:vAlign w:val="center"/>
+          </w:tcPr>
+          <w:p>
+            <w:r>
+              <w:t xml:space="preserve">Jersey </w:t>
+            </w:r>
+            <w:proofErr w:type="spellStart"/>
+            <w:r>
+              <w:t>number</w:t>
+            </w:r>
+            <w:proofErr w:type="spellEnd"/>
+          </w:p>
+        </w:tc>
+        <w:tc>
+          <w:tcPr>
+            <w:tcW w:w="4500" w:type="dxa"/>
+            <w:vAlign w:val="center"/>
+          </w:tcPr>
+          <w:p>
+            <w:pPr>
+              <w:bidi/>
+              <w:jc w:val="right"/>
+            </w:pPr>
+            <w:r>
+              <w:rPr>
+                <w:rFonts w:ascii="Traditional Arabic" w:eastAsia="Traditional Arabic" w:hAnsi="Traditional Arabic" w:cs="Traditional Arabic"/>
+                <w:sz w:val="26"/>
+                <w:szCs w:val="26"/>
+                <w:rtl/>
+              </w:rPr>
+              <w:t>رقم القميص</w:t>
+            </w:r>
+          </w:p>
+        </w:tc>
+      </w:tr>
+      <w:tr>
+        <w:tblPrEx>
+          <w:tblCellMar>
+            <w:top w:w="0" w:type="dxa"/>
+            <w:bottom w:w="0" w:type="dxa"/>
+          </w:tblCellMar>
+        </w:tblPrEx>
+        <w:tc>
+          <w:tcPr>
+            <w:tcW w:w="4500" w:type="dxa"/>
+            <w:vAlign w:val="center"/>
+          </w:tcPr>
+          <w:p>
+            <w:pPr>
+              <w:rPr>
+                <w:lang w:val="en-US"/>
+              </w:rPr>
+            </w:pPr>
+            <w:r>
+              <w:rPr>
+                <w:lang w:val="en-US"/>
+              </w:rPr>
+              <w:t>Club (team a player plays for)</w:t>
+            </w:r>
+          </w:p>
+        </w:tc>
+        <w:tc>
+          <w:tcPr>
+            <w:tcW w:w="4500" w:type="dxa"/>
+            <w:vAlign w:val="center"/>
+          </w:tcPr>
+          <w:p>
+            <w:pPr>
+              <w:bidi/>
+              <w:jc w:val="right"/>
+            </w:pPr>
+            <w:r>
+              <w:rPr>
+                <w:rFonts w:ascii="Traditional Arabic" w:eastAsia="Traditional Arabic" w:hAnsi="Traditional Arabic" w:cs="Traditional Arabic"/>
+                <w:sz w:val="26"/>
+                <w:szCs w:val="26"/>
+                <w:rtl/>
+              </w:rPr>
+              <w:t>نادٍ</w:t>
+            </w:r>
+          </w:p>
+        </w:tc>
+      </w:tr>
+    </w:tbl>
+    <w:p>
+      <w:pPr>
+        <w:pStyle w:val="Titre2"/>
+        <w:spacing w:before="240"/>
+      </w:pPr>
+      <w:proofErr w:type="spellStart"/>
+      <w:r>
+        <w:rPr>
+          <w:b/>
+          <w:bCs/>
+        </w:rPr>
+        <w:t>Morocco's</w:t>
+      </w:r>
+      <w:proofErr w:type="spellEnd"/>
+      <w:r>
+        <w:rPr>
+          <w:b/>
+          <w:bCs/>
+        </w:rPr>
+        <w:t xml:space="preserve"> Final 26-Player Squad</w:t>
+      </w:r>
+    </w:p>
+    <w:p>
+      <w:pPr>
+        <w:spacing w:after="160"/>
+        <w:rPr>
+          <w:lang w:val="en-US"/>
+        </w:rPr>
+      </w:pPr>
+      <w:r>
+        <w:rPr>
+          <w:i/>
+          <w:iCs/>
+          <w:sz w:val="20"/>
+          <w:szCs w:val="20"/>
+          <w:lang w:val="en-US"/>
+        </w:rPr>
+        <w:t>Use this table for a matching or classification activity: students can sort players by position or by the country of their club.</w:t>
+      </w:r>
+    </w:p>
+    <w:tbl>
+      <w:tblPr>
+        <w:tblW w:w="9000" w:type="dxa"/>
+        <w:tblBorders>
+          <w:top w:val="single" w:sz="4" w:space="0" w:color="auto"/>
+          <w:left w:val="single" w:sz="4" w:space="0" w:color="auto"/>
+          <w:bottom w:val="single" w:sz="4" w:space="0" w:color="auto"/>
+          <w:right w:val="single" w:sz="4" w:space="0" w:color="auto"/>
+          <w:insideH w:val="single" w:sz="4" w:space="0" w:color="auto"/>
+          <w:insideV w:val="single" w:sz="4" w:space="0" w:color="auto"/>
+        </w:tblBorders>
+        <w:tblCellMar>
+          <w:left w:w="10" w:type="dxa"/>
+          <w:right w:w="10" w:type="dxa"/>
+        </w:tblCellMar>
+        <w:tblLook w:val="04A0" w:firstRow="1" w:lastRow="0" w:firstColumn="1" w:lastColumn="0" w:noHBand="0" w:noVBand="1"/>
+      </w:tblPr>
+      <w:tblGrid>
+        <w:gridCol w:w="3000"/>
+        <w:gridCol w:w="1600"/>
+        <w:gridCol w:w="1900"/>
+        <w:gridCol w:w="2500"/>
+      </w:tblGrid>
+      <w:tr>
+        <w:tblPrEx>
+          <w:tblCellMar>
+            <w:top w:w="0" w:type="dxa"/>
+            <w:bottom w:w="0" w:type="dxa"/>
+          </w:tblCellMar>
+        </w:tblPrEx>
+        <w:trPr>
+          <w:tblHeader/>
+        </w:trPr>
+        <w:tc>
+          <w:tcPr>
+            <w:tcW w:w="3000" w:type="dxa"/>
+            <w:shd w:val="clear" w:color="auto" w:fill="EFEFEF"/>
+            <w:vAlign w:val="center"/>
+          </w:tcPr>
+          <w:p>
+            <w:r>
+              <w:rPr>
+                <w:b/>
+                <w:bCs/>
+              </w:rPr>
+              <w:lastRenderedPageBreak/>
+              <w:t>Player</w:t>
+            </w:r>
+          </w:p>
+        </w:tc>
+        <w:tc>
+          <w:tcPr>
+            <w:tcW w:w="1600" w:type="dxa"/>
+            <w:shd w:val="clear" w:color="auto" w:fill="EFEFEF"/>
+            <w:vAlign w:val="center"/>
+          </w:tcPr>
+          <w:p>
+            <w:r>
+              <w:rPr>
+                <w:b/>
+                <w:bCs/>
+              </w:rPr>
+              <w:t>Position</w:t>
+            </w:r>
+          </w:p>
+        </w:tc>
+        <w:tc>
+          <w:tcPr>
+            <w:tcW w:w="1900" w:type="dxa"/>
+            <w:shd w:val="clear" w:color="auto" w:fill="EFEFEF"/>
+            <w:vAlign w:val="center"/>
+          </w:tcPr>
+          <w:p>
+            <w:proofErr w:type="spellStart"/>
+            <w:proofErr w:type="gramStart"/>
+            <w:r>
+              <w:rPr>
+                <w:b/>
+                <w:bCs/>
+              </w:rPr>
+              <w:t>الموقع</w:t>
+            </w:r>
+            <w:proofErr w:type="spellEnd"/>
+            <w:proofErr w:type="gramEnd"/>
+            <w:r>
+              <w:rPr>
+                <w:b/>
+                <w:bCs/>
+              </w:rPr>
+              <w:t xml:space="preserve"> (</w:t>
+            </w:r>
+            <w:proofErr w:type="spellStart"/>
+            <w:r>
+              <w:rPr>
+                <w:b/>
+                <w:bCs/>
+              </w:rPr>
+              <w:t>Arabic</w:t>
+            </w:r>
+            <w:proofErr w:type="spellEnd"/>
+            <w:r>
+              <w:rPr>
+                <w:b/>
+                <w:bCs/>
+              </w:rPr>
+              <w:t>)</w:t>
+            </w:r>
+          </w:p>
+        </w:tc>
+        <w:tc>
+          <w:tcPr>
+            <w:tcW w:w="2500" w:type="dxa"/>
+            <w:shd w:val="clear" w:color="auto" w:fill="EFEFEF"/>
+            <w:vAlign w:val="center"/>
+          </w:tcPr>
+          <w:p>
+            <w:r>
+              <w:rPr>
+                <w:b/>
+                <w:bCs/>
+              </w:rPr>
+              <w:t>Club</w:t>
+            </w:r>
+          </w:p>
+        </w:tc>
+      </w:tr>
+      <w:tr>
+        <w:tblPrEx>
+          <w:tblCellMar>
+            <w:top w:w="0" w:type="dxa"/>
+            <w:bottom w:w="0" w:type="dxa"/>
+          </w:tblCellMar>
+        </w:tblPrEx>
+        <w:tc>
+          <w:tcPr>
+            <w:tcW w:w="3000" w:type="dxa"/>
+            <w:vAlign w:val="center"/>
+          </w:tcPr>
+          <w:p>
+            <w:r>
+              <w:t>Yassine Bounou ("Bono")</w:t>
+            </w:r>
+          </w:p>
+        </w:tc>
+        <w:tc>
+          <w:tcPr>
+            <w:tcW w:w="1600" w:type="dxa"/>
+            <w:vAlign w:val="center"/>
+          </w:tcPr>
+          <w:p>
+            <w:proofErr w:type="spellStart"/>
+            <w:r>
+              <w:t>Goalkeeper</w:t>
+            </w:r>
+            <w:proofErr w:type="spellEnd"/>
+          </w:p>
+        </w:tc>
+        <w:tc>
+          <w:tcPr>
+            <w:tcW w:w="1900" w:type="dxa"/>
+            <w:vAlign w:val="center"/>
+          </w:tcPr>
+          <w:p>
+            <w:pPr>
+              <w:bidi/>
+              <w:jc w:val="right"/>
+            </w:pPr>
+            <w:r>
+              <w:rPr>
+                <w:rFonts w:ascii="Traditional Arabic" w:eastAsia="Traditional Arabic" w:hAnsi="Traditional Arabic" w:cs="Traditional Arabic"/>
+                <w:sz w:val="26"/>
+                <w:szCs w:val="26"/>
+                <w:rtl/>
+              </w:rPr>
+              <w:t>حارس مرمى</w:t>
+            </w:r>
+          </w:p>
+        </w:tc>
+        <w:tc>
+          <w:tcPr>
+            <w:tcW w:w="2500" w:type="dxa"/>
+            <w:vAlign w:val="center"/>
+          </w:tcPr>
+          <w:p>
+            <w:r>
+              <w:t>Al-Hilal (</w:t>
+            </w:r>
+            <w:proofErr w:type="spellStart"/>
+            <w:r>
+              <w:t>Saudi</w:t>
+            </w:r>
+            <w:proofErr w:type="spellEnd"/>
+            <w:r>
+              <w:t xml:space="preserve"> Arabia)</w:t>
+            </w:r>
+          </w:p>
+        </w:tc>
+      </w:tr>
+      <w:tr>
+        <w:tblPrEx>
+          <w:tblCellMar>
+            <w:top w:w="0" w:type="dxa"/>
+            <w:bottom w:w="0" w:type="dxa"/>
+          </w:tblCellMar>
+        </w:tblPrEx>
+        <w:tc>
+          <w:tcPr>
+            <w:tcW w:w="3000" w:type="dxa"/>
+            <w:vAlign w:val="center"/>
+          </w:tcPr>
+          <w:p>
+            <w:r>
+              <w:t xml:space="preserve">Munir </w:t>
+            </w:r>
+            <w:proofErr w:type="spellStart"/>
+            <w:r>
+              <w:t>Mohamedi</w:t>
+            </w:r>
+            <w:proofErr w:type="spellEnd"/>
+            <w:r>
+              <w:t xml:space="preserve"> (El </w:t>
+            </w:r>
+            <w:proofErr w:type="spellStart"/>
+            <w:r>
+              <w:t>Kajoui</w:t>
+            </w:r>
+            <w:proofErr w:type="spellEnd"/>
+            <w:r>
+              <w:t>)</w:t>
+            </w:r>
+          </w:p>
+        </w:tc>
+        <w:tc>
+          <w:tcPr>
+            <w:tcW w:w="1600" w:type="dxa"/>
+            <w:vAlign w:val="center"/>
+          </w:tcPr>
+          <w:p>
+            <w:proofErr w:type="spellStart"/>
+            <w:r>
+              <w:t>Goalkeeper</w:t>
+            </w:r>
+            <w:proofErr w:type="spellEnd"/>
+          </w:p>
+        </w:tc>
+        <w:tc>
+          <w:tcPr>
+            <w:tcW w:w="1900" w:type="dxa"/>
+            <w:vAlign w:val="center"/>
+          </w:tcPr>
+          <w:p>
+            <w:pPr>
+              <w:bidi/>
+              <w:jc w:val="right"/>
+            </w:pPr>
+            <w:r>
+              <w:rPr>
+                <w:rFonts w:ascii="Traditional Arabic" w:eastAsia="Traditional Arabic" w:hAnsi="Traditional Arabic" w:cs="Traditional Arabic"/>
+                <w:sz w:val="26"/>
+                <w:szCs w:val="26"/>
+                <w:rtl/>
+              </w:rPr>
+              <w:t>حارس مرمى</w:t>
+            </w:r>
+          </w:p>
+        </w:tc>
+        <w:tc>
+          <w:tcPr>
+            <w:tcW w:w="2500" w:type="dxa"/>
+            <w:vAlign w:val="center"/>
+          </w:tcPr>
+          <w:p>
+            <w:r>
+              <w:t>RS Berkane (Morocco)</w:t>
+            </w:r>
+          </w:p>
+        </w:tc>
+      </w:tr>
+      <w:tr>
+        <w:tblPrEx>
+          <w:tblCellMar>
+            <w:top w:w="0" w:type="dxa"/>
+            <w:bottom w:w="0" w:type="dxa"/>
+          </w:tblCellMar>
+        </w:tblPrEx>
+        <w:tc>
+          <w:tcPr>
+            <w:tcW w:w="3000" w:type="dxa"/>
+            <w:vAlign w:val="center"/>
+          </w:tcPr>
+          <w:p>
+            <w:r>
+              <w:t xml:space="preserve">Ahmed Reda </w:t>
+            </w:r>
+            <w:proofErr w:type="spellStart"/>
+            <w:r>
+              <w:t>Tagnaouti</w:t>
+            </w:r>
+            <w:proofErr w:type="spellEnd"/>
+          </w:p>
+        </w:tc>
+        <w:tc>
+          <w:tcPr>
+            <w:tcW w:w="1600" w:type="dxa"/>
+            <w:vAlign w:val="center"/>
+          </w:tcPr>
+          <w:p>
+            <w:proofErr w:type="spellStart"/>
+            <w:r>
+              <w:t>Goalkeeper</w:t>
+            </w:r>
+            <w:proofErr w:type="spellEnd"/>
+          </w:p>
+        </w:tc>
+        <w:tc>
+          <w:tcPr>
+            <w:tcW w:w="1900" w:type="dxa"/>
+            <w:vAlign w:val="center"/>
+          </w:tcPr>
+          <w:p>
+            <w:pPr>
+              <w:bidi/>
+              <w:jc w:val="right"/>
+            </w:pPr>
+            <w:r>
+              <w:rPr>
+                <w:rFonts w:ascii="Traditional Arabic" w:eastAsia="Traditional Arabic" w:hAnsi="Traditional Arabic" w:cs="Traditional Arabic"/>
+                <w:sz w:val="26"/>
+                <w:szCs w:val="26"/>
+                <w:rtl/>
+              </w:rPr>
+              <w:t>حارس مرمى</w:t>
+            </w:r>
+          </w:p>
+        </w:tc>
+        <w:tc>
+          <w:tcPr>
+            <w:tcW w:w="2500" w:type="dxa"/>
+            <w:vAlign w:val="center"/>
+          </w:tcPr>
+          <w:p>
+            <w:r>
+              <w:t>AS FAR (Morocco)</w:t>
+            </w:r>
+          </w:p>
+        </w:tc>
+      </w:tr>
+      <w:tr>
+        <w:tblPrEx>
+          <w:tblCellMar>
+            <w:top w:w="0" w:type="dxa"/>
+            <w:bottom w:w="0" w:type="dxa"/>
+          </w:tblCellMar>
+        </w:tblPrEx>
+        <w:tc>
+          <w:tcPr>
+            <w:tcW w:w="3000" w:type="dxa"/>
+            <w:vAlign w:val="center"/>
+          </w:tcPr>
+          <w:p>
+            <w:r>
+              <w:t xml:space="preserve">Achraf </w:t>
+            </w:r>
+            <w:proofErr w:type="spellStart"/>
+            <w:r>
+              <w:t>Hakimi</w:t>
+            </w:r>
+            <w:proofErr w:type="spellEnd"/>
+            <w:r>
+              <w:t xml:space="preserve"> (</w:t>
+            </w:r>
+            <w:proofErr w:type="spellStart"/>
+            <w:r>
+              <w:t>Captain</w:t>
+            </w:r>
+            <w:proofErr w:type="spellEnd"/>
+            <w:r>
+              <w:t>)</w:t>
+            </w:r>
+          </w:p>
+        </w:tc>
+        <w:tc>
+          <w:tcPr>
+            <w:tcW w:w="1600" w:type="dxa"/>
+            <w:vAlign w:val="center"/>
+          </w:tcPr>
+          <w:p>
+            <w:r>
+              <w:t>Defender</w:t>
+            </w:r>
+          </w:p>
+        </w:tc>
+        <w:tc>
+          <w:tcPr>
+            <w:tcW w:w="1900" w:type="dxa"/>
+            <w:vAlign w:val="center"/>
+          </w:tcPr>
+          <w:p>
+            <w:pPr>
+              <w:bidi/>
+              <w:jc w:val="right"/>
+            </w:pPr>
+            <w:r>
+              <w:rPr>
+                <w:rFonts w:ascii="Traditional Arabic" w:eastAsia="Traditional Arabic" w:hAnsi="Traditional Arabic" w:cs="Traditional Arabic"/>
+                <w:sz w:val="26"/>
+                <w:szCs w:val="26"/>
+                <w:rtl/>
+              </w:rPr>
+              <w:t>مدافع (قائد الفريق)</w:t>
+            </w:r>
+          </w:p>
+        </w:tc>
+        <w:tc>
+          <w:tcPr>
+            <w:tcW w:w="2500" w:type="dxa"/>
+            <w:vAlign w:val="center"/>
+          </w:tcPr>
+          <w:p>
+            <w:r>
+              <w:t>Paris Saint-Germain (France)</w:t>
+            </w:r>
+          </w:p>
+        </w:tc>
+      </w:tr>
+      <w:tr>
+        <w:tblPrEx>
+          <w:tblCellMar>
+            <w:top w:w="0" w:type="dxa"/>
+            <w:bottom w:w="0" w:type="dxa"/>
+          </w:tblCellMar>
+        </w:tblPrEx>
+        <w:tc>
+          <w:tcPr>
+            <w:tcW w:w="3000" w:type="dxa"/>
+            <w:vAlign w:val="center"/>
+          </w:tcPr>
+          <w:p>
+            <w:proofErr w:type="spellStart"/>
+            <w:r>
+              <w:t>Noussair</w:t>
+            </w:r>
+            <w:proofErr w:type="spellEnd"/>
+            <w:r>
+              <w:t xml:space="preserve"> </w:t>
+            </w:r>
+            <w:proofErr w:type="spellStart"/>
+            <w:r>
+              <w:t>Mazraoui</w:t>
+            </w:r>
+            <w:proofErr w:type="spellEnd"/>
+          </w:p>
+        </w:tc>
+        <w:tc>
+          <w:tcPr>
+            <w:tcW w:w="1600" w:type="dxa"/>
+            <w:vAlign w:val="center"/>
+          </w:tcPr>
+          <w:p>
+            <w:r>
+              <w:t>Defender</w:t>
+            </w:r>
+          </w:p>
+        </w:tc>
+        <w:tc>
+          <w:tcPr>
+            <w:tcW w:w="1900" w:type="dxa"/>
+            <w:vAlign w:val="center"/>
+          </w:tcPr>
+          <w:p>
+            <w:pPr>
+              <w:bidi/>
+              <w:jc w:val="right"/>
+            </w:pPr>
+            <w:r>
+              <w:rPr>
+                <w:rFonts w:ascii="Traditional Arabic" w:eastAsia="Traditional Arabic" w:hAnsi="Traditional Arabic" w:cs="Traditional Arabic"/>
+                <w:sz w:val="26"/>
+                <w:szCs w:val="26"/>
+                <w:rtl/>
+              </w:rPr>
+              <w:t>مدافع</w:t>
+            </w:r>
+          </w:p>
+        </w:tc>
+        <w:tc>
+          <w:tcPr>
+            <w:tcW w:w="2500" w:type="dxa"/>
+            <w:vAlign w:val="center"/>
+          </w:tcPr>
+          <w:p>
+            <w:r>
+              <w:t>Manchester United (</w:t>
+            </w:r>
+            <w:proofErr w:type="spellStart"/>
+            <w:r>
+              <w:t>England</w:t>
+            </w:r>
+            <w:proofErr w:type="spellEnd"/>
+            <w:r>
+              <w:t>)</w:t>
+            </w:r>
+          </w:p>
+        </w:tc>
+      </w:tr>
+      <w:tr>
+        <w:tblPrEx>
+          <w:tblCellMar>
+            <w:top w:w="0" w:type="dxa"/>
+            <w:bottom w:w="0" w:type="dxa"/>
+          </w:tblCellMar>
+        </w:tblPrEx>
+        <w:tc>
+          <w:tcPr>
+            <w:tcW w:w="3000" w:type="dxa"/>
+            <w:vAlign w:val="center"/>
+          </w:tcPr>
+          <w:p>
+            <w:r>
+              <w:t>Anass Salah-Eddine</w:t>
+            </w:r>
+          </w:p>
+        </w:tc>
+        <w:tc>
+          <w:tcPr>
+            <w:tcW w:w="1600" w:type="dxa"/>
+            <w:vAlign w:val="center"/>
+          </w:tcPr>
+          <w:p>
+            <w:r>
+              <w:t>Defender</w:t>
+            </w:r>
+          </w:p>
+        </w:tc>
+        <w:tc>
+          <w:tcPr>
+            <w:tcW w:w="1900" w:type="dxa"/>
+            <w:vAlign w:val="center"/>
+          </w:tcPr>
+          <w:p>
+            <w:pPr>
+              <w:bidi/>
+              <w:jc w:val="right"/>
+            </w:pPr>
+            <w:r>
+              <w:rPr>
+                <w:rFonts w:ascii="Traditional Arabic" w:eastAsia="Traditional Arabic" w:hAnsi="Traditional Arabic" w:cs="Traditional Arabic"/>
+                <w:sz w:val="26"/>
+                <w:szCs w:val="26"/>
+                <w:rtl/>
+              </w:rPr>
+              <w:t>مدافع</w:t>
+            </w:r>
+          </w:p>
+        </w:tc>
+        <w:tc>
+          <w:tcPr>
+            <w:tcW w:w="2500" w:type="dxa"/>
+            <w:vAlign w:val="center"/>
+          </w:tcPr>
+          <w:p>
+            <w:r>
+              <w:rPr>
+                <w:color w:val="03122B"/>
+                <w:shd w:val="clear" w:color="auto" w:fill="FFFFFF"/>
+              </w:rPr>
+              <w:t>PSV Eindhoven</w:t>
+            </w:r>
+            <w:r>
+              <w:t xml:space="preserve"> (</w:t>
+            </w:r>
+            <w:proofErr w:type="spellStart"/>
+            <w:r>
+              <w:t>Netherlands</w:t>
+            </w:r>
+            <w:proofErr w:type="spellEnd"/>
+            <w:r>
+              <w:t>)</w:t>
+            </w:r>
+          </w:p>
+        </w:tc>
+      </w:tr>
+      <w:tr>
+        <w:tblPrEx>
+          <w:tblCellMar>
+            <w:top w:w="0" w:type="dxa"/>
+            <w:bottom w:w="0" w:type="dxa"/>
+          </w:tblCellMar>
+        </w:tblPrEx>
+        <w:tc>
+          <w:tcPr>
+            <w:tcW w:w="3000" w:type="dxa"/>
+            <w:vAlign w:val="center"/>
+          </w:tcPr>
+          <w:p>
+            <w:r>
+              <w:t xml:space="preserve">Youssef </w:t>
+            </w:r>
+            <w:proofErr w:type="spellStart"/>
+            <w:r>
+              <w:t>Bellammari</w:t>
+            </w:r>
+            <w:proofErr w:type="spellEnd"/>
+          </w:p>
+        </w:tc>
+        <w:tc>
+          <w:tcPr>
+            <w:tcW w:w="1600" w:type="dxa"/>
+            <w:vAlign w:val="center"/>
+          </w:tcPr>
+          <w:p>
+            <w:r>
+              <w:t>Defender</w:t>
+            </w:r>
+          </w:p>
+        </w:tc>
+        <w:tc>
+          <w:tcPr>
+            <w:tcW w:w="1900" w:type="dxa"/>
+            <w:vAlign w:val="center"/>
+          </w:tcPr>
+          <w:p>
+            <w:pPr>
+              <w:bidi/>
+              <w:jc w:val="right"/>
+            </w:pPr>
+            <w:r>
+              <w:rPr>
+                <w:rFonts w:ascii="Traditional Arabic" w:eastAsia="Traditional Arabic" w:hAnsi="Traditional Arabic" w:cs="Traditional Arabic"/>
+                <w:sz w:val="26"/>
+                <w:szCs w:val="26"/>
+                <w:rtl/>
+              </w:rPr>
+              <w:t>مدافع</w:t>
+            </w:r>
+          </w:p>
+        </w:tc>
+        <w:tc>
+          <w:tcPr>
+            <w:tcW w:w="2500" w:type="dxa"/>
+            <w:vAlign w:val="center"/>
+          </w:tcPr>
+          <w:p>
+            <w:r>
+              <w:t>Al Ahly (</w:t>
+            </w:r>
+            <w:proofErr w:type="spellStart"/>
+            <w:r>
+              <w:t>Egypt</w:t>
+            </w:r>
+            <w:proofErr w:type="spellEnd"/>
+            <w:r>
+              <w:t>)</w:t>
+            </w:r>
+          </w:p>
+        </w:tc>
+      </w:tr>
+      <w:tr>
+        <w:tblPrEx>
+          <w:tblCellMar>
+            <w:top w:w="0" w:type="dxa"/>
+            <w:bottom w:w="0" w:type="dxa"/>
+          </w:tblCellMar>
+        </w:tblPrEx>
+        <w:tc>
+          <w:tcPr>
+            <w:tcW w:w="3000" w:type="dxa"/>
+            <w:vAlign w:val="center"/>
+          </w:tcPr>
+          <w:p>
+            <w:r>
+              <w:t xml:space="preserve">Zakaria El </w:t>
+            </w:r>
+            <w:proofErr w:type="spellStart"/>
+            <w:r>
+              <w:t>Ouahdi</w:t>
+            </w:r>
+            <w:proofErr w:type="spellEnd"/>
+          </w:p>
+        </w:tc>
+        <w:tc>
+          <w:tcPr>
+            <w:tcW w:w="1600" w:type="dxa"/>
+            <w:vAlign w:val="center"/>
+          </w:tcPr>
+          <w:p>
+            <w:r>
+              <w:t>Defender</w:t>
+            </w:r>
+          </w:p>
+        </w:tc>
+        <w:tc>
+          <w:tcPr>
+            <w:tcW w:w="1900" w:type="dxa"/>
+            <w:vAlign w:val="center"/>
+          </w:tcPr>
+          <w:p>
+            <w:pPr>
+              <w:bidi/>
+              <w:jc w:val="right"/>
+            </w:pPr>
+            <w:r>
+              <w:rPr>
+                <w:rFonts w:ascii="Traditional Arabic" w:eastAsia="Traditional Arabic" w:hAnsi="Traditional Arabic" w:cs="Traditional Arabic"/>
+                <w:sz w:val="26"/>
+                <w:szCs w:val="26"/>
+                <w:rtl/>
+              </w:rPr>
+              <w:t>مدافع</w:t>
+            </w:r>
+          </w:p>
+        </w:tc>
+        <w:tc>
+          <w:tcPr>
+            <w:tcW w:w="2500" w:type="dxa"/>
+            <w:vAlign w:val="center"/>
+          </w:tcPr>
+          <w:p>
+            <w:r>
+              <w:t>Genk (</w:t>
+            </w:r>
+            <w:proofErr w:type="spellStart"/>
+            <w:r>
+              <w:t>Belgium</w:t>
+            </w:r>
+            <w:proofErr w:type="spellEnd"/>
+            <w:r>
+              <w:t>)</w:t>
+            </w:r>
+          </w:p>
+        </w:tc>
+      </w:tr>
+      <w:tr>
+        <w:tblPrEx>
+          <w:tblCellMar>
+            <w:top w:w="0" w:type="dxa"/>
+            <w:bottom w:w="0" w:type="dxa"/>
+          </w:tblCellMar>
+        </w:tblPrEx>
+        <w:tc>
+          <w:tcPr>
+            <w:tcW w:w="3000" w:type="dxa"/>
+            <w:vAlign w:val="center"/>
+          </w:tcPr>
+          <w:p>
+            <w:r>
+              <w:t>Chadi Riad</w:t>
+            </w:r>
+          </w:p>
+        </w:tc>
+        <w:tc>
+          <w:tcPr>
+            <w:tcW w:w="1600" w:type="dxa"/>
+            <w:vAlign w:val="center"/>
+          </w:tcPr>
+          <w:p>
+            <w:r>
+              <w:t>Defender</w:t>
+            </w:r>
+          </w:p>
+        </w:tc>
+        <w:tc>
+          <w:tcPr>
+            <w:tcW w:w="1900" w:type="dxa"/>
+            <w:vAlign w:val="center"/>
+          </w:tcPr>
+          <w:p>
+            <w:pPr>
+              <w:bidi/>
+              <w:jc w:val="right"/>
+            </w:pPr>
+            <w:r>
+              <w:rPr>
+                <w:rFonts w:ascii="Traditional Arabic" w:eastAsia="Traditional Arabic" w:hAnsi="Traditional Arabic" w:cs="Traditional Arabic"/>
+                <w:sz w:val="26"/>
+                <w:szCs w:val="26"/>
+                <w:rtl/>
+              </w:rPr>
+              <w:t>مدافع</w:t>
+            </w:r>
+          </w:p>
+        </w:tc>
+        <w:tc>
+          <w:tcPr>
+            <w:tcW w:w="2500" w:type="dxa"/>
+            <w:vAlign w:val="center"/>
+          </w:tcPr>
+          <w:p>
+            <w:r>
+              <w:t>Crystal Palace (</w:t>
+            </w:r>
+            <w:proofErr w:type="spellStart"/>
+            <w:r>
+              <w:t>England</w:t>
+            </w:r>
+            <w:proofErr w:type="spellEnd"/>
+            <w:r>
+              <w:t>)</w:t>
+            </w:r>
+          </w:p>
+        </w:tc>
+      </w:tr>
+      <w:tr>
+        <w:tblPrEx>
+          <w:tblCellMar>
+            <w:top w:w="0" w:type="dxa"/>
+            <w:bottom w:w="0" w:type="dxa"/>
+          </w:tblCellMar>
+        </w:tblPrEx>
+        <w:tc>
+          <w:tcPr>
+            <w:tcW w:w="3000" w:type="dxa"/>
+            <w:vAlign w:val="center"/>
+          </w:tcPr>
+          <w:p>
+            <w:r>
+              <w:t xml:space="preserve">Redouane </w:t>
+            </w:r>
+            <w:proofErr w:type="spellStart"/>
+            <w:r>
+              <w:t>Hahlal</w:t>
+            </w:r>
+            <w:proofErr w:type="spellEnd"/>
+          </w:p>
+        </w:tc>
+        <w:tc>
+          <w:tcPr>
+            <w:tcW w:w="1600" w:type="dxa"/>
+            <w:vAlign w:val="center"/>
+          </w:tcPr>
+          <w:p>
+            <w:r>
+              <w:t>Defender</w:t>
+            </w:r>
+          </w:p>
+        </w:tc>
+        <w:tc>
+          <w:tcPr>
+            <w:tcW w:w="1900" w:type="dxa"/>
+            <w:vAlign w:val="center"/>
+          </w:tcPr>
+          <w:p>
+            <w:pPr>
+              <w:bidi/>
+              <w:jc w:val="right"/>
+            </w:pPr>
+            <w:r>
+              <w:rPr>
+                <w:rFonts w:ascii="Traditional Arabic" w:eastAsia="Traditional Arabic" w:hAnsi="Traditional Arabic" w:cs="Traditional Arabic"/>
+                <w:sz w:val="26"/>
+                <w:szCs w:val="26"/>
+                <w:rtl/>
+              </w:rPr>
+              <w:t>مدافع</w:t>
+            </w:r>
+          </w:p>
+        </w:tc>
+        <w:tc>
+          <w:tcPr>
+            <w:tcW w:w="2500" w:type="dxa"/>
+            <w:vAlign w:val="center"/>
+          </w:tcPr>
+          <w:p>
+            <w:r>
+              <w:t>Mechelen (</w:t>
+            </w:r>
+            <w:proofErr w:type="spellStart"/>
+            <w:r>
+              <w:t>Belgium</w:t>
+            </w:r>
+            <w:proofErr w:type="spellEnd"/>
+            <w:r>
+              <w:t>)</w:t>
+            </w:r>
+          </w:p>
+        </w:tc>
+      </w:tr>
+      <w:tr>
+        <w:tblPrEx>
+          <w:tblCellMar>
+            <w:top w:w="0" w:type="dxa"/>
+            <w:bottom w:w="0" w:type="dxa"/>
+          </w:tblCellMar>
+        </w:tblPrEx>
+        <w:tc>
+          <w:tcPr>
+            <w:tcW w:w="3000" w:type="dxa"/>
+            <w:vAlign w:val="center"/>
+          </w:tcPr>
+          <w:p>
+            <w:r>
+              <w:t>Issa Diop</w:t>
+            </w:r>
+          </w:p>
+        </w:tc>
+        <w:tc>
+          <w:tcPr>
+            <w:tcW w:w="1600" w:type="dxa"/>
+            <w:vAlign w:val="center"/>
+          </w:tcPr>
+          <w:p>
+            <w:r>
+              <w:t>Defender</w:t>
+            </w:r>
+          </w:p>
+        </w:tc>
+        <w:tc>
+          <w:tcPr>
+            <w:tcW w:w="1900" w:type="dxa"/>
+            <w:vAlign w:val="center"/>
+          </w:tcPr>
+          <w:p>
+            <w:pPr>
+              <w:bidi/>
+              <w:jc w:val="right"/>
+            </w:pPr>
+            <w:r>
+              <w:rPr>
+                <w:rFonts w:ascii="Traditional Arabic" w:eastAsia="Traditional Arabic" w:hAnsi="Traditional Arabic" w:cs="Traditional Arabic"/>
+                <w:sz w:val="26"/>
+                <w:szCs w:val="26"/>
+                <w:rtl/>
+              </w:rPr>
+              <w:t>مدافع</w:t>
+            </w:r>
+          </w:p>
+        </w:tc>
+        <w:tc>
+          <w:tcPr>
+            <w:tcW w:w="2500" w:type="dxa"/>
+            <w:vAlign w:val="center"/>
+          </w:tcPr>
+          <w:p>
+            <w:proofErr w:type="spellStart"/>
+            <w:r>
+              <w:t>Fulham</w:t>
+            </w:r>
+            <w:proofErr w:type="spellEnd"/>
+            <w:r>
+              <w:t xml:space="preserve"> (</w:t>
+            </w:r>
+            <w:proofErr w:type="spellStart"/>
+            <w:r>
+              <w:t>England</w:t>
+            </w:r>
+            <w:proofErr w:type="spellEnd"/>
+            <w:r>
+              <w:t>)</w:t>
+            </w:r>
+          </w:p>
+        </w:tc>
+      </w:tr>
+      <w:tr>
+        <w:tblPrEx>
+          <w:tblCellMar>
+            <w:top w:w="0" w:type="dxa"/>
+            <w:bottom w:w="0" w:type="dxa"/>
+          </w:tblCellMar>
+        </w:tblPrEx>
+        <w:tc>
+          <w:tcPr>
+            <w:tcW w:w="3000" w:type="dxa"/>
+            <w:vAlign w:val="center"/>
+          </w:tcPr>
+          <w:p>
+            <w:r>
+              <w:t xml:space="preserve">Marwane </w:t>
+            </w:r>
+            <w:proofErr w:type="spellStart"/>
+            <w:r>
+              <w:t>Saâdane</w:t>
+            </w:r>
+            <w:proofErr w:type="spellEnd"/>
+          </w:p>
+        </w:tc>
+        <w:tc>
+          <w:tcPr>
+            <w:tcW w:w="1600" w:type="dxa"/>
+            <w:vAlign w:val="center"/>
+          </w:tcPr>
+          <w:p>
+            <w:r>
+              <w:t>Defender</w:t>
+            </w:r>
+          </w:p>
+        </w:tc>
+        <w:tc>
+          <w:tcPr>
+            <w:tcW w:w="1900" w:type="dxa"/>
+            <w:vAlign w:val="center"/>
+          </w:tcPr>
+          <w:p>
+            <w:pPr>
+              <w:bidi/>
+              <w:jc w:val="right"/>
+            </w:pPr>
+            <w:r>
+              <w:rPr>
+                <w:rFonts w:ascii="Traditional Arabic" w:eastAsia="Traditional Arabic" w:hAnsi="Traditional Arabic" w:cs="Traditional Arabic"/>
+                <w:sz w:val="26"/>
+                <w:szCs w:val="26"/>
+                <w:rtl/>
+              </w:rPr>
+              <w:t>مدافع</w:t>
+            </w:r>
+          </w:p>
+        </w:tc>
+        <w:tc>
+          <w:tcPr>
+            <w:tcW w:w="2500" w:type="dxa"/>
+            <w:vAlign w:val="center"/>
+          </w:tcPr>
+          <w:p>
+            <w:r>
+              <w:t>Al-</w:t>
+            </w:r>
+            <w:proofErr w:type="spellStart"/>
+            <w:r>
+              <w:t>Fateh</w:t>
+            </w:r>
+            <w:proofErr w:type="spellEnd"/>
+            <w:r>
+              <w:t xml:space="preserve"> (</w:t>
+            </w:r>
+            <w:proofErr w:type="spellStart"/>
+            <w:r>
+              <w:t>Saudi</w:t>
+            </w:r>
+            <w:proofErr w:type="spellEnd"/>
+            <w:r>
+              <w:t xml:space="preserve"> Arabia)</w:t>
+            </w:r>
+          </w:p>
+        </w:tc>
+      </w:tr>
+      <w:tr>
+        <w:tblPrEx>
+          <w:tblCellMar>
+            <w:top w:w="0" w:type="dxa"/>
+            <w:bottom w:w="0" w:type="dxa"/>
+          </w:tblCellMar>
+        </w:tblPrEx>
+        <w:tc>
+          <w:tcPr>
+            <w:tcW w:w="3000" w:type="dxa"/>
+            <w:vAlign w:val="center"/>
+          </w:tcPr>
+          <w:p>
+            <w:proofErr w:type="spellStart"/>
+            <w:r>
+              <w:t>Sofyan</w:t>
+            </w:r>
+            <w:proofErr w:type="spellEnd"/>
+            <w:r>
+              <w:t xml:space="preserve"> </w:t>
+            </w:r>
+            <w:proofErr w:type="spellStart"/>
+            <w:r>
+              <w:t>Amrabat</w:t>
+            </w:r>
+            <w:proofErr w:type="spellEnd"/>
+          </w:p>
+        </w:tc>
+        <w:tc>
+          <w:tcPr>
+            <w:tcW w:w="1600" w:type="dxa"/>
+            <w:vAlign w:val="center"/>
+          </w:tcPr>
+          <w:p>
+            <w:proofErr w:type="spellStart"/>
+            <w:r>
+              <w:t>Midfielder</w:t>
+            </w:r>
+            <w:proofErr w:type="spellEnd"/>
+          </w:p>
+        </w:tc>
+        <w:tc>
+          <w:tcPr>
+            <w:tcW w:w="1900" w:type="dxa"/>
+            <w:vAlign w:val="center"/>
+          </w:tcPr>
+          <w:p>
+            <w:pPr>
+              <w:bidi/>
+              <w:jc w:val="right"/>
+            </w:pPr>
+            <w:r>
+              <w:rPr>
+                <w:rFonts w:ascii="Traditional Arabic" w:eastAsia="Traditional Arabic" w:hAnsi="Traditional Arabic" w:cs="Traditional Arabic"/>
+                <w:sz w:val="26"/>
+                <w:szCs w:val="26"/>
+                <w:rtl/>
+              </w:rPr>
+              <w:t>لاعب وسط</w:t>
+            </w:r>
+          </w:p>
+        </w:tc>
+        <w:tc>
+          <w:tcPr>
+            <w:tcW w:w="2500" w:type="dxa"/>
+            <w:vAlign w:val="center"/>
+          </w:tcPr>
+          <w:p>
+            <w:r>
+              <w:t xml:space="preserve">Real </w:t>
+            </w:r>
+            <w:proofErr w:type="spellStart"/>
+            <w:r>
+              <w:t>Betis</w:t>
+            </w:r>
+            <w:proofErr w:type="spellEnd"/>
+            <w:r>
+              <w:t xml:space="preserve"> (Spain)</w:t>
+            </w:r>
+          </w:p>
+        </w:tc>
+      </w:tr>
+      <w:tr>
+        <w:tblPrEx>
+          <w:tblCellMar>
+            <w:top w:w="0" w:type="dxa"/>
+            <w:bottom w:w="0" w:type="dxa"/>
+          </w:tblCellMar>
+        </w:tblPrEx>
+        <w:tc>
+          <w:tcPr>
+            <w:tcW w:w="3000" w:type="dxa"/>
+            <w:vAlign w:val="center"/>
+          </w:tcPr>
+          <w:p>
+            <w:proofErr w:type="spellStart"/>
+            <w:r>
+              <w:t>Ismael</w:t>
+            </w:r>
+            <w:proofErr w:type="spellEnd"/>
+            <w:r>
+              <w:t xml:space="preserve"> </w:t>
+            </w:r>
+            <w:proofErr w:type="spellStart"/>
+            <w:r>
+              <w:t>Saibari</w:t>
+            </w:r>
+            <w:proofErr w:type="spellEnd"/>
+          </w:p>
+        </w:tc>
+        <w:tc>
+          <w:tcPr>
+            <w:tcW w:w="1600" w:type="dxa"/>
+            <w:vAlign w:val="center"/>
+          </w:tcPr>
+          <w:p>
+            <w:proofErr w:type="spellStart"/>
+            <w:r>
+              <w:t>Midfielder</w:t>
+            </w:r>
+            <w:proofErr w:type="spellEnd"/>
+          </w:p>
+        </w:tc>
+        <w:tc>
+          <w:tcPr>
+            <w:tcW w:w="1900" w:type="dxa"/>
+            <w:vAlign w:val="center"/>
+          </w:tcPr>
+          <w:p>
+            <w:pPr>
+              <w:bidi/>
+              <w:jc w:val="right"/>
+            </w:pPr>
+            <w:r>
+              <w:rPr>
+                <w:rFonts w:ascii="Traditional Arabic" w:eastAsia="Traditional Arabic" w:hAnsi="Traditional Arabic" w:cs="Traditional Arabic"/>
+                <w:sz w:val="26"/>
+                <w:szCs w:val="26"/>
+                <w:rtl/>
+              </w:rPr>
+              <w:t>لاعب وسط</w:t>
+            </w:r>
+          </w:p>
+        </w:tc>
+        <w:tc>
+          <w:tcPr>
+            <w:tcW w:w="2500" w:type="dxa"/>
+            <w:vAlign w:val="center"/>
+          </w:tcPr>
+          <w:p>
+            <w:r>
+              <w:t>PSV Eindhoven (</w:t>
+            </w:r>
+            <w:proofErr w:type="spellStart"/>
+            <w:r>
+              <w:t>Netherlands</w:t>
+            </w:r>
+            <w:proofErr w:type="spellEnd"/>
+            <w:r>
+              <w:t>)</w:t>
+            </w:r>
+          </w:p>
+        </w:tc>
+      </w:tr>
+      <w:tr>
+        <w:tblPrEx>
+          <w:tblCellMar>
+            <w:top w:w="0" w:type="dxa"/>
+            <w:bottom w:w="0" w:type="dxa"/>
+          </w:tblCellMar>
+        </w:tblPrEx>
+        <w:tc>
+          <w:tcPr>
+            <w:tcW w:w="3000" w:type="dxa"/>
+            <w:vAlign w:val="center"/>
+          </w:tcPr>
+          <w:p>
+            <w:r>
+              <w:t xml:space="preserve">Neil El </w:t>
+            </w:r>
+            <w:proofErr w:type="spellStart"/>
+            <w:r>
+              <w:t>Aynaoui</w:t>
+            </w:r>
+            <w:proofErr w:type="spellEnd"/>
+          </w:p>
+        </w:tc>
+        <w:tc>
+          <w:tcPr>
+            <w:tcW w:w="1600" w:type="dxa"/>
+            <w:vAlign w:val="center"/>
+          </w:tcPr>
+          <w:p>
+            <w:proofErr w:type="spellStart"/>
+            <w:r>
+              <w:t>Midfielder</w:t>
+            </w:r>
+            <w:proofErr w:type="spellEnd"/>
+          </w:p>
+        </w:tc>
+        <w:tc>
+          <w:tcPr>
+            <w:tcW w:w="1900" w:type="dxa"/>
+            <w:vAlign w:val="center"/>
+          </w:tcPr>
+          <w:p>
+            <w:pPr>
+              <w:bidi/>
+              <w:jc w:val="right"/>
+            </w:pPr>
+            <w:r>
+              <w:rPr>
+                <w:rFonts w:ascii="Traditional Arabic" w:eastAsia="Traditional Arabic" w:hAnsi="Traditional Arabic" w:cs="Traditional Arabic"/>
+                <w:sz w:val="26"/>
+                <w:szCs w:val="26"/>
+                <w:rtl/>
+              </w:rPr>
+              <w:t>لاعب وسط</w:t>
+            </w:r>
+          </w:p>
+        </w:tc>
+        <w:tc>
+          <w:tcPr>
+            <w:tcW w:w="2500" w:type="dxa"/>
+            <w:vAlign w:val="center"/>
+          </w:tcPr>
+          <w:p>
+            <w:r>
+              <w:t>Roma (</w:t>
+            </w:r>
+            <w:proofErr w:type="spellStart"/>
+            <w:r>
+              <w:t>Italy</w:t>
+            </w:r>
+            <w:proofErr w:type="spellEnd"/>
+            <w:r>
+              <w:t>)</w:t>
+            </w:r>
+          </w:p>
+        </w:tc>
+      </w:tr>
+      <w:tr>
+        <w:tblPrEx>
+          <w:tblCellMar>
+            <w:top w:w="0" w:type="dxa"/>
+            <w:bottom w:w="0" w:type="dxa"/>
+          </w:tblCellMar>
+        </w:tblPrEx>
+        <w:tc>
+          <w:tcPr>
+            <w:tcW w:w="3000" w:type="dxa"/>
+            <w:vAlign w:val="center"/>
+          </w:tcPr>
+          <w:p>
+            <w:r>
+              <w:t xml:space="preserve">Bilal El </w:t>
+            </w:r>
+            <w:proofErr w:type="spellStart"/>
+            <w:r>
+              <w:t>Khannouss</w:t>
+            </w:r>
+            <w:proofErr w:type="spellEnd"/>
+          </w:p>
+        </w:tc>
+        <w:tc>
+          <w:tcPr>
+            <w:tcW w:w="1600" w:type="dxa"/>
+            <w:vAlign w:val="center"/>
+          </w:tcPr>
+          <w:p>
+            <w:proofErr w:type="spellStart"/>
+            <w:r>
+              <w:t>Midfielder</w:t>
+            </w:r>
+            <w:proofErr w:type="spellEnd"/>
+          </w:p>
+        </w:tc>
+        <w:tc>
+          <w:tcPr>
+            <w:tcW w:w="1900" w:type="dxa"/>
+            <w:vAlign w:val="center"/>
+          </w:tcPr>
+          <w:p>
+            <w:pPr>
+              <w:bidi/>
+              <w:jc w:val="right"/>
+            </w:pPr>
+            <w:r>
+              <w:rPr>
+                <w:rFonts w:ascii="Traditional Arabic" w:eastAsia="Traditional Arabic" w:hAnsi="Traditional Arabic" w:cs="Traditional Arabic"/>
+                <w:sz w:val="26"/>
+                <w:szCs w:val="26"/>
+                <w:rtl/>
+              </w:rPr>
+              <w:t>لاعب وسط</w:t>
+            </w:r>
+          </w:p>
+        </w:tc>
+        <w:tc>
+          <w:tcPr>
+            <w:tcW w:w="2500" w:type="dxa"/>
+            <w:vAlign w:val="center"/>
+          </w:tcPr>
+          <w:p>
+            <w:r>
+              <w:t>Stuttgart (Germany)</w:t>
+            </w:r>
+          </w:p>
+        </w:tc>
+      </w:tr>
+      <w:tr>
+        <w:tblPrEx>
+          <w:tblCellMar>
+            <w:top w:w="0" w:type="dxa"/>
+            <w:bottom w:w="0" w:type="dxa"/>
+          </w:tblCellMar>
+        </w:tblPrEx>
+        <w:tc>
+          <w:tcPr>
+            <w:tcW w:w="3000" w:type="dxa"/>
+            <w:vAlign w:val="center"/>
+          </w:tcPr>
+          <w:p>
+            <w:r>
+              <w:t xml:space="preserve">Azzedine </w:t>
+            </w:r>
+            <w:proofErr w:type="spellStart"/>
+            <w:r>
+              <w:t>Ounahi</w:t>
+            </w:r>
+            <w:proofErr w:type="spellEnd"/>
+          </w:p>
+        </w:tc>
+        <w:tc>
+          <w:tcPr>
+            <w:tcW w:w="1600" w:type="dxa"/>
+            <w:vAlign w:val="center"/>
+          </w:tcPr>
+          <w:p>
+            <w:proofErr w:type="spellStart"/>
+            <w:r>
+              <w:t>Midfielder</w:t>
+            </w:r>
+            <w:proofErr w:type="spellEnd"/>
+          </w:p>
+        </w:tc>
+        <w:tc>
+          <w:tcPr>
+            <w:tcW w:w="1900" w:type="dxa"/>
+            <w:vAlign w:val="center"/>
+          </w:tcPr>
+          <w:p>
+            <w:pPr>
+              <w:bidi/>
+              <w:jc w:val="right"/>
+            </w:pPr>
+            <w:r>
+              <w:rPr>
+                <w:rFonts w:ascii="Traditional Arabic" w:eastAsia="Traditional Arabic" w:hAnsi="Traditional Arabic" w:cs="Traditional Arabic"/>
+                <w:sz w:val="26"/>
+                <w:szCs w:val="26"/>
+                <w:rtl/>
+              </w:rPr>
+              <w:t>لاعب وسط</w:t>
+            </w:r>
+          </w:p>
+        </w:tc>
+        <w:tc>
+          <w:tcPr>
+            <w:tcW w:w="2500" w:type="dxa"/>
+            <w:vAlign w:val="center"/>
+          </w:tcPr>
+          <w:p>
+            <w:proofErr w:type="spellStart"/>
+            <w:r>
+              <w:t>Girona</w:t>
+            </w:r>
+            <w:proofErr w:type="spellEnd"/>
+            <w:r>
+              <w:t xml:space="preserve"> (Spain)</w:t>
+            </w:r>
+          </w:p>
+        </w:tc>
+      </w:tr>
+      <w:tr>
+        <w:tblPrEx>
+          <w:tblCellMar>
+            <w:top w:w="0" w:type="dxa"/>
+            <w:bottom w:w="0" w:type="dxa"/>
+          </w:tblCellMar>
+        </w:tblPrEx>
+        <w:tc>
+          <w:tcPr>
+            <w:tcW w:w="3000" w:type="dxa"/>
+            <w:vAlign w:val="center"/>
+          </w:tcPr>
+          <w:p>
+            <w:proofErr w:type="spellStart"/>
+            <w:r>
+              <w:t>Ayyoub</w:t>
+            </w:r>
+            <w:proofErr w:type="spellEnd"/>
+            <w:r>
+              <w:t xml:space="preserve"> </w:t>
+            </w:r>
+            <w:proofErr w:type="spellStart"/>
+            <w:r>
+              <w:t>Bouaddi</w:t>
+            </w:r>
+            <w:proofErr w:type="spellEnd"/>
+          </w:p>
+        </w:tc>
+        <w:tc>
+          <w:tcPr>
+            <w:tcW w:w="1600" w:type="dxa"/>
+            <w:vAlign w:val="center"/>
+          </w:tcPr>
+          <w:p>
+            <w:proofErr w:type="spellStart"/>
+            <w:r>
+              <w:t>Midfielder</w:t>
+            </w:r>
+            <w:proofErr w:type="spellEnd"/>
+          </w:p>
+        </w:tc>
+        <w:tc>
+          <w:tcPr>
+            <w:tcW w:w="1900" w:type="dxa"/>
+            <w:vAlign w:val="center"/>
+          </w:tcPr>
+          <w:p>
+            <w:pPr>
+              <w:bidi/>
+              <w:jc w:val="right"/>
+            </w:pPr>
+            <w:r>
+              <w:rPr>
+                <w:rFonts w:ascii="Traditional Arabic" w:eastAsia="Traditional Arabic" w:hAnsi="Traditional Arabic" w:cs="Traditional Arabic"/>
+                <w:sz w:val="26"/>
+                <w:szCs w:val="26"/>
+                <w:rtl/>
+              </w:rPr>
+              <w:t>لاعب وسط</w:t>
+            </w:r>
+          </w:p>
+        </w:tc>
+        <w:tc>
+          <w:tcPr>
+            <w:tcW w:w="2500" w:type="dxa"/>
+            <w:vAlign w:val="center"/>
+          </w:tcPr>
+          <w:p>
+            <w:r>
+              <w:t>Lille (France)</w:t>
+            </w:r>
+          </w:p>
+        </w:tc>
+      </w:tr>
+      <w:tr>
+        <w:tblPrEx>
+          <w:tblCellMar>
+            <w:top w:w="0" w:type="dxa"/>
+            <w:bottom w:w="0" w:type="dxa"/>
+          </w:tblCellMar>
+        </w:tblPrEx>
+        <w:tc>
+          <w:tcPr>
+            <w:tcW w:w="3000" w:type="dxa"/>
+            <w:vAlign w:val="center"/>
+          </w:tcPr>
+          <w:p>
+            <w:r>
+              <w:t xml:space="preserve">Samir El </w:t>
+            </w:r>
+            <w:proofErr w:type="spellStart"/>
+            <w:r>
+              <w:t>Mourabet</w:t>
+            </w:r>
+            <w:proofErr w:type="spellEnd"/>
+          </w:p>
+        </w:tc>
+        <w:tc>
+          <w:tcPr>
+            <w:tcW w:w="1600" w:type="dxa"/>
+            <w:vAlign w:val="center"/>
+          </w:tcPr>
+          <w:p>
+            <w:proofErr w:type="spellStart"/>
+            <w:r>
+              <w:t>Midfielder</w:t>
+            </w:r>
+            <w:proofErr w:type="spellEnd"/>
+          </w:p>
+        </w:tc>
+        <w:tc>
+          <w:tcPr>
+            <w:tcW w:w="1900" w:type="dxa"/>
+            <w:vAlign w:val="center"/>
+          </w:tcPr>
+          <w:p>
+            <w:pPr>
+              <w:bidi/>
+              <w:jc w:val="right"/>
+            </w:pPr>
+            <w:r>
+              <w:rPr>
+                <w:rFonts w:ascii="Traditional Arabic" w:eastAsia="Traditional Arabic" w:hAnsi="Traditional Arabic" w:cs="Traditional Arabic"/>
+                <w:sz w:val="26"/>
+                <w:szCs w:val="26"/>
+                <w:rtl/>
+              </w:rPr>
+              <w:t>لاعب وسط</w:t>
+            </w:r>
+          </w:p>
+        </w:tc>
+        <w:tc>
+          <w:tcPr>
+            <w:tcW w:w="2500" w:type="dxa"/>
+            <w:vAlign w:val="center"/>
+          </w:tcPr>
+          <w:p>
+            <w:r>
+              <w:t>Strasbourg (France)</w:t>
+            </w:r>
+          </w:p>
+        </w:tc>
+      </w:tr>
+      <w:tr>
+        <w:tblPrEx>
+          <w:tblCellMar>
+            <w:top w:w="0" w:type="dxa"/>
+            <w:bottom w:w="0" w:type="dxa"/>
+          </w:tblCellMar>
+        </w:tblPrEx>
+        <w:tc>
+          <w:tcPr>
+            <w:tcW w:w="3000" w:type="dxa"/>
+            <w:vAlign w:val="center"/>
+          </w:tcPr>
+          <w:p>
+            <w:r>
+              <w:t xml:space="preserve">Brahim </w:t>
+            </w:r>
+            <w:proofErr w:type="spellStart"/>
+            <w:r>
+              <w:t>Díaz</w:t>
+            </w:r>
+            <w:proofErr w:type="spellEnd"/>
+          </w:p>
+        </w:tc>
+        <w:tc>
+          <w:tcPr>
+            <w:tcW w:w="1600" w:type="dxa"/>
+            <w:vAlign w:val="center"/>
+          </w:tcPr>
+          <w:p>
+            <w:proofErr w:type="spellStart"/>
+            <w:r>
+              <w:t>Forward</w:t>
+            </w:r>
+            <w:proofErr w:type="spellEnd"/>
+          </w:p>
+        </w:tc>
+        <w:tc>
+          <w:tcPr>
+            <w:tcW w:w="1900" w:type="dxa"/>
+            <w:vAlign w:val="center"/>
+          </w:tcPr>
+          <w:p>
+            <w:pPr>
+              <w:bidi/>
+              <w:jc w:val="right"/>
+            </w:pPr>
+            <w:r>
+              <w:rPr>
+                <w:rFonts w:ascii="Traditional Arabic" w:eastAsia="Traditional Arabic" w:hAnsi="Traditional Arabic" w:cs="Traditional Arabic"/>
+                <w:sz w:val="26"/>
+                <w:szCs w:val="26"/>
+                <w:rtl/>
+              </w:rPr>
+              <w:t>مهاجم</w:t>
+            </w:r>
+          </w:p>
+        </w:tc>
+        <w:tc>
+          <w:tcPr>
+            <w:tcW w:w="2500" w:type="dxa"/>
+            <w:vAlign w:val="center"/>
+          </w:tcPr>
+          <w:p>
+            <w:r>
+              <w:t>Real Madrid (Spain)</w:t>
+            </w:r>
+          </w:p>
+        </w:tc>
+      </w:tr>
+      <w:tr>
+        <w:tblPrEx>
+          <w:tblCellMar>
+            <w:top w:w="0" w:type="dxa"/>
+            <w:bottom w:w="0" w:type="dxa"/>
+          </w:tblCellMar>
+        </w:tblPrEx>
+        <w:tc>
+          <w:tcPr>
+            <w:tcW w:w="3000" w:type="dxa"/>
+            <w:vAlign w:val="center"/>
+          </w:tcPr>
+          <w:p>
+            <w:proofErr w:type="spellStart"/>
+            <w:r>
+              <w:t>Chemsdine</w:t>
+            </w:r>
+            <w:proofErr w:type="spellEnd"/>
+            <w:r>
+              <w:t xml:space="preserve"> </w:t>
+            </w:r>
+            <w:proofErr w:type="spellStart"/>
+            <w:r>
+              <w:t>Talbi</w:t>
+            </w:r>
+            <w:proofErr w:type="spellEnd"/>
+          </w:p>
+        </w:tc>
+        <w:tc>
+          <w:tcPr>
+            <w:tcW w:w="1600" w:type="dxa"/>
+            <w:vAlign w:val="center"/>
+          </w:tcPr>
+          <w:p>
+            <w:proofErr w:type="spellStart"/>
+            <w:r>
+              <w:t>Forward</w:t>
+            </w:r>
+            <w:proofErr w:type="spellEnd"/>
+          </w:p>
+        </w:tc>
+        <w:tc>
+          <w:tcPr>
+            <w:tcW w:w="1900" w:type="dxa"/>
+            <w:vAlign w:val="center"/>
+          </w:tcPr>
+          <w:p>
+            <w:pPr>
+              <w:bidi/>
+              <w:jc w:val="right"/>
+            </w:pPr>
+            <w:r>
+              <w:rPr>
+                <w:rFonts w:ascii="Traditional Arabic" w:eastAsia="Traditional Arabic" w:hAnsi="Traditional Arabic" w:cs="Traditional Arabic"/>
+                <w:sz w:val="26"/>
+                <w:szCs w:val="26"/>
+                <w:rtl/>
+              </w:rPr>
+              <w:t>مهاجم</w:t>
+            </w:r>
+          </w:p>
+        </w:tc>
+        <w:tc>
+          <w:tcPr>
+            <w:tcW w:w="2500" w:type="dxa"/>
+            <w:vAlign w:val="center"/>
+          </w:tcPr>
+          <w:p>
+            <w:r>
+              <w:t>Sunderland (</w:t>
+            </w:r>
+            <w:proofErr w:type="spellStart"/>
+            <w:r>
+              <w:t>England</w:t>
+            </w:r>
+            <w:proofErr w:type="spellEnd"/>
+            <w:r>
+              <w:t>)</w:t>
+            </w:r>
+          </w:p>
+        </w:tc>
+      </w:tr>
+      <w:tr>
+        <w:tblPrEx>
+          <w:tblCellMar>
+            <w:top w:w="0" w:type="dxa"/>
+            <w:bottom w:w="0" w:type="dxa"/>
+          </w:tblCellMar>
+        </w:tblPrEx>
+        <w:tc>
+          <w:tcPr>
+            <w:tcW w:w="3000" w:type="dxa"/>
+            <w:vAlign w:val="center"/>
+          </w:tcPr>
+          <w:p>
+            <w:r>
+              <w:t xml:space="preserve">Ayoub El </w:t>
+            </w:r>
+            <w:proofErr w:type="spellStart"/>
+            <w:r>
+              <w:t>Kaabi</w:t>
+            </w:r>
+            <w:proofErr w:type="spellEnd"/>
+          </w:p>
+        </w:tc>
+        <w:tc>
+          <w:tcPr>
+            <w:tcW w:w="1600" w:type="dxa"/>
+            <w:vAlign w:val="center"/>
+          </w:tcPr>
+          <w:p>
+            <w:proofErr w:type="spellStart"/>
+            <w:r>
+              <w:t>Forward</w:t>
+            </w:r>
+            <w:proofErr w:type="spellEnd"/>
+          </w:p>
+        </w:tc>
+        <w:tc>
+          <w:tcPr>
+            <w:tcW w:w="1900" w:type="dxa"/>
+            <w:vAlign w:val="center"/>
+          </w:tcPr>
+          <w:p>
+            <w:pPr>
+              <w:bidi/>
+              <w:jc w:val="right"/>
+            </w:pPr>
+            <w:r>
+              <w:rPr>
+                <w:rFonts w:ascii="Traditional Arabic" w:eastAsia="Traditional Arabic" w:hAnsi="Traditional Arabic" w:cs="Traditional Arabic"/>
+                <w:sz w:val="26"/>
+                <w:szCs w:val="26"/>
+                <w:rtl/>
+              </w:rPr>
+              <w:t>مهاجم</w:t>
+            </w:r>
+          </w:p>
+        </w:tc>
+        <w:tc>
+          <w:tcPr>
+            <w:tcW w:w="2500" w:type="dxa"/>
+            <w:vAlign w:val="center"/>
+          </w:tcPr>
+          <w:p>
+            <w:proofErr w:type="spellStart"/>
+            <w:r>
+              <w:t>Olympiacos</w:t>
+            </w:r>
+            <w:proofErr w:type="spellEnd"/>
+            <w:r>
+              <w:t xml:space="preserve"> (</w:t>
+            </w:r>
+            <w:proofErr w:type="spellStart"/>
+            <w:r>
+              <w:t>Greece</w:t>
+            </w:r>
+            <w:proofErr w:type="spellEnd"/>
+            <w:r>
+              <w:t>)</w:t>
+            </w:r>
+          </w:p>
+        </w:tc>
+      </w:tr>
+      <w:tr>
+        <w:tblPrEx>
+          <w:tblCellMar>
+            <w:top w:w="0" w:type="dxa"/>
+            <w:bottom w:w="0" w:type="dxa"/>
+          </w:tblCellMar>
+        </w:tblPrEx>
+        <w:tc>
+          <w:tcPr>
+            <w:tcW w:w="3000" w:type="dxa"/>
+            <w:vAlign w:val="center"/>
+          </w:tcPr>
+          <w:p>
+            <w:r>
+              <w:t>Soufiane Rahimi</w:t>
+            </w:r>
+          </w:p>
+        </w:tc>
+        <w:tc>
+          <w:tcPr>
+            <w:tcW w:w="1600" w:type="dxa"/>
+            <w:vAlign w:val="center"/>
+          </w:tcPr>
+          <w:p>
+            <w:proofErr w:type="spellStart"/>
+            <w:r>
+              <w:t>Forward</w:t>
+            </w:r>
+            <w:proofErr w:type="spellEnd"/>
+          </w:p>
+        </w:tc>
+        <w:tc>
+          <w:tcPr>
+            <w:tcW w:w="1900" w:type="dxa"/>
+            <w:vAlign w:val="center"/>
+          </w:tcPr>
+          <w:p>
+            <w:pPr>
+              <w:bidi/>
+              <w:jc w:val="right"/>
+            </w:pPr>
+            <w:r>
+              <w:rPr>
+                <w:rFonts w:ascii="Traditional Arabic" w:eastAsia="Traditional Arabic" w:hAnsi="Traditional Arabic" w:cs="Traditional Arabic"/>
+                <w:sz w:val="26"/>
+                <w:szCs w:val="26"/>
+                <w:rtl/>
+              </w:rPr>
+              <w:t>مهاجم</w:t>
+            </w:r>
+          </w:p>
+        </w:tc>
+        <w:tc>
+          <w:tcPr>
+            <w:tcW w:w="2500" w:type="dxa"/>
+            <w:vAlign w:val="center"/>
+          </w:tcPr>
+          <w:p>
+            <w:proofErr w:type="spellStart"/>
+            <w:r>
+              <w:t>Al-Ain</w:t>
+            </w:r>
+            <w:proofErr w:type="spellEnd"/>
+            <w:r>
+              <w:t xml:space="preserve"> (UAE)</w:t>
+            </w:r>
+          </w:p>
+        </w:tc>
+      </w:tr>
+      <w:tr>
+        <w:tblPrEx>
+          <w:tblCellMar>
+            <w:top w:w="0" w:type="dxa"/>
+            <w:bottom w:w="0" w:type="dxa"/>
+          </w:tblCellMar>
+        </w:tblPrEx>
+        <w:tc>
+          <w:tcPr>
+            <w:tcW w:w="3000" w:type="dxa"/>
+            <w:vAlign w:val="center"/>
+          </w:tcPr>
+          <w:p>
+            <w:r>
+              <w:t xml:space="preserve">Ayoub </w:t>
+            </w:r>
+            <w:proofErr w:type="spellStart"/>
+            <w:r>
+              <w:t>Amaimouni</w:t>
+            </w:r>
+            <w:proofErr w:type="spellEnd"/>
+          </w:p>
+        </w:tc>
+        <w:tc>
+          <w:tcPr>
+            <w:tcW w:w="1600" w:type="dxa"/>
+            <w:vAlign w:val="center"/>
+          </w:tcPr>
+          <w:p>
+            <w:proofErr w:type="spellStart"/>
+            <w:r>
+              <w:t>Forward</w:t>
+            </w:r>
+            <w:proofErr w:type="spellEnd"/>
+          </w:p>
+        </w:tc>
+        <w:tc>
+          <w:tcPr>
+            <w:tcW w:w="1900" w:type="dxa"/>
+            <w:vAlign w:val="center"/>
+          </w:tcPr>
+          <w:p>
+            <w:pPr>
+              <w:bidi/>
+              <w:jc w:val="right"/>
+            </w:pPr>
+            <w:r>
+              <w:rPr>
+                <w:rFonts w:ascii="Traditional Arabic" w:eastAsia="Traditional Arabic" w:hAnsi="Traditional Arabic" w:cs="Traditional Arabic"/>
+                <w:sz w:val="26"/>
+                <w:szCs w:val="26"/>
+                <w:rtl/>
+              </w:rPr>
+              <w:t>مهاجم</w:t>
+            </w:r>
+          </w:p>
+        </w:tc>
+        <w:tc>
+          <w:tcPr>
+            <w:tcW w:w="2500" w:type="dxa"/>
+            <w:vAlign w:val="center"/>
+          </w:tcPr>
+          <w:p>
+            <w:proofErr w:type="spellStart"/>
+            <w:r>
+              <w:t>Eintracht</w:t>
+            </w:r>
+            <w:proofErr w:type="spellEnd"/>
+            <w:r>
+              <w:t xml:space="preserve"> Frankfurt (Germany)</w:t>
+            </w:r>
+          </w:p>
+        </w:tc>
+      </w:tr>
+      <w:tr>
+        <w:tblPrEx>
+          <w:tblCellMar>
+            <w:top w:w="0" w:type="dxa"/>
+            <w:bottom w:w="0" w:type="dxa"/>
+          </w:tblCellMar>
+        </w:tblPrEx>
+        <w:tc>
+          <w:tcPr>
+            <w:tcW w:w="3000" w:type="dxa"/>
+            <w:vAlign w:val="center"/>
+          </w:tcPr>
+          <w:p>
+            <w:r>
+              <w:t xml:space="preserve">Yassine </w:t>
+            </w:r>
+            <w:proofErr w:type="spellStart"/>
+            <w:r>
+              <w:t>Gessime</w:t>
+            </w:r>
+            <w:proofErr w:type="spellEnd"/>
+          </w:p>
+        </w:tc>
+        <w:tc>
+          <w:tcPr>
+            <w:tcW w:w="1600" w:type="dxa"/>
+            <w:vAlign w:val="center"/>
+          </w:tcPr>
+          <w:p>
+            <w:proofErr w:type="spellStart"/>
+            <w:r>
+              <w:t>Forward</w:t>
+            </w:r>
+            <w:proofErr w:type="spellEnd"/>
+          </w:p>
+        </w:tc>
+        <w:tc>
+          <w:tcPr>
+            <w:tcW w:w="1900" w:type="dxa"/>
+            <w:vAlign w:val="center"/>
+          </w:tcPr>
+          <w:p>
+            <w:pPr>
+              <w:bidi/>
+              <w:jc w:val="right"/>
+            </w:pPr>
+            <w:r>
+              <w:rPr>
+                <w:rFonts w:ascii="Traditional Arabic" w:eastAsia="Traditional Arabic" w:hAnsi="Traditional Arabic" w:cs="Traditional Arabic"/>
+                <w:sz w:val="26"/>
+                <w:szCs w:val="26"/>
+                <w:rtl/>
+              </w:rPr>
+              <w:t>مهاجم</w:t>
+            </w:r>
+          </w:p>
+        </w:tc>
+        <w:tc>
+          <w:tcPr>
+            <w:tcW w:w="2500" w:type="dxa"/>
+            <w:vAlign w:val="center"/>
+          </w:tcPr>
+          <w:p>
+            <w:r>
+              <w:t>Strasbourg (France)</w:t>
+            </w:r>
+          </w:p>
+        </w:tc>
+      </w:tr>
+      <w:tr>
+        <w:tblPrEx>
+          <w:tblCellMar>
+            <w:top w:w="0" w:type="dxa"/>
+            <w:bottom w:w="0" w:type="dxa"/>
+          </w:tblCellMar>
+        </w:tblPrEx>
+        <w:tc>
+          <w:tcPr>
+            <w:tcW w:w="3000" w:type="dxa"/>
+            <w:vAlign w:val="center"/>
+          </w:tcPr>
+          <w:p>
+            <w:r>
+              <w:t xml:space="preserve">Amine </w:t>
+            </w:r>
+            <w:proofErr w:type="spellStart"/>
+            <w:r>
+              <w:t>Sbaï</w:t>
+            </w:r>
+            <w:proofErr w:type="spellEnd"/>
+          </w:p>
+        </w:tc>
+        <w:tc>
+          <w:tcPr>
+            <w:tcW w:w="1600" w:type="dxa"/>
+            <w:vAlign w:val="center"/>
+          </w:tcPr>
+          <w:p>
+            <w:proofErr w:type="spellStart"/>
+            <w:r>
+              <w:t>Forward</w:t>
+            </w:r>
+            <w:proofErr w:type="spellEnd"/>
+          </w:p>
+        </w:tc>
+        <w:tc>
+          <w:tcPr>
+            <w:tcW w:w="1900" w:type="dxa"/>
+            <w:vAlign w:val="center"/>
+          </w:tcPr>
+          <w:p>
+            <w:pPr>
+              <w:bidi/>
+              <w:jc w:val="right"/>
+            </w:pPr>
+            <w:r>
+              <w:rPr>
+                <w:rFonts w:ascii="Traditional Arabic" w:eastAsia="Traditional Arabic" w:hAnsi="Traditional Arabic" w:cs="Traditional Arabic"/>
+                <w:sz w:val="26"/>
+                <w:szCs w:val="26"/>
+                <w:rtl/>
+              </w:rPr>
+              <w:t>مهاجم</w:t>
+            </w:r>
+          </w:p>
+        </w:tc>
+        <w:tc>
+          <w:tcPr>
+            <w:tcW w:w="2500" w:type="dxa"/>
+            <w:vAlign w:val="center"/>
+          </w:tcPr>
+          <w:p>
+            <w:r>
+              <w:t>Angers (France)</w:t>
+            </w:r>
+          </w:p>
+        </w:tc>
+      </w:tr>
+    </w:tbl>
+    <w:p/>
+    <w:p>
+      <w:pPr>
+        <w:rPr>
+          <w:lang w:val="en-US"/>
+        </w:rPr>
+      </w:pPr>
+    </w:p>
+    <w:p>
+      <w:pPr>
+        <w:rPr>
+          <w:lang w:val="en-US"/>
+        </w:rPr>
+      </w:pPr>
+      <w:r>
+        <w:rPr>
+          <w:lang w:val="en-US"/>
+        </w:rPr>
+        <w:br w:type="page"/>
+      </w:r>
+    </w:p>
+    <w:p>
+      <w:pPr>
+        <w:rPr>
+          <w:lang w:val="en-US"/>
+        </w:rPr>
+      </w:pPr>
+    </w:p>
+    <w:p>
+      <w:pPr>
+        <w:rPr>
+          <w:lang w:val="en-US"/>
+        </w:rPr>
+      </w:pPr>
+    </w:p>
+    <w:p>
+      <w:pPr>
+        <w:pStyle w:val="Titre1"/>
         <w:pBdr>
           <w:bottom w:val="single" w:sz="8" w:space="4" w:color="1E6FA8"/>
         </w:pBdr>
@@ -4429,7 +7661,6 @@
           <w:szCs w:val="30"/>
           <w:lang w:val="en-US"/>
         </w:rPr>
-        <w:lastRenderedPageBreak/>
         <w:t>Lesson 2: World Cup Culture, Symbols, and Moroccan Football</w:t>
       </w:r>
     </w:p>
@@ -5259,6 +8490,7 @@
           <w:color w:val="1E6FA8"/>
           <w:lang w:val="en-US"/>
         </w:rPr>
+        <w:lastRenderedPageBreak/>
         <w:t xml:space="preserve">2. </w:t>
       </w:r>
       <w:r>
@@ -5320,7 +8552,6 @@
                 <w:szCs w:val="24"/>
                 <w:lang w:val="en-US"/>
               </w:rPr>
-              <w:lastRenderedPageBreak/>
               <w:t>THE OFFICIAL 2026 FIFA WORLD CUP MASCOTS</w:t>
             </w:r>
           </w:p>
@@ -6822,7 +10053,6 @@
           <w:color w:val="1E6FA8"/>
           <w:lang w:val="en-US"/>
         </w:rPr>
-        <w:lastRenderedPageBreak/>
         <w:t xml:space="preserve">2. </w:t>
       </w:r>
       <w:r>
@@ -20653,11 +23883,7 @@
       <w:pPr>
         <w:spacing w:after="160"/>
         <w:jc w:val="center"/>
-        <w:rPr>
-          <w:lang w:val="en-US"/>
-        </w:rPr>
-      </w:pPr>
-      <w:proofErr w:type="gramStart"/>
+      </w:pPr>
       <w:r>
         <w:rPr>
           <w:i/>
@@ -20665,12 +23891,10 @@
           <w:color w:val="666666"/>
           <w:sz w:val="18"/>
           <w:szCs w:val="18"/>
-          <w:lang w:val="en-US"/>
         </w:rPr>
         <w:t>Nata‘</w:t>
       </w:r>
       <w:proofErr w:type="spellStart"/>
-      <w:proofErr w:type="gramEnd"/>
       <w:r>
         <w:rPr>
           <w:i/>
@@ -20678,7 +23902,6 @@
           <w:color w:val="666666"/>
           <w:sz w:val="18"/>
           <w:szCs w:val="18"/>
-          <w:lang w:val="en-US"/>
         </w:rPr>
         <w:t>allamul</w:t>
       </w:r>
@@ -20690,7 +23913,6 @@
           <w:color w:val="666666"/>
           <w:sz w:val="18"/>
           <w:szCs w:val="18"/>
-          <w:lang w:val="en-US"/>
         </w:rPr>
         <w:t>-‘</w:t>
       </w:r>
@@ -20702,7 +23924,6 @@
           <w:color w:val="666666"/>
           <w:sz w:val="18"/>
           <w:szCs w:val="18"/>
-          <w:lang w:val="en-US"/>
         </w:rPr>
         <w:t>arabiyyata</w:t>
       </w:r>
@@ -20714,7 +23935,6 @@
           <w:color w:val="666666"/>
           <w:sz w:val="18"/>
           <w:szCs w:val="18"/>
-          <w:lang w:val="en-US"/>
         </w:rPr>
         <w:t xml:space="preserve"> bi-</w:t>
       </w:r>
@@ -20726,7 +23946,6 @@
           <w:color w:val="666666"/>
           <w:sz w:val="18"/>
           <w:szCs w:val="18"/>
-          <w:lang w:val="en-US"/>
         </w:rPr>
         <w:t>ibtisāmatin</w:t>
       </w:r>
@@ -20738,7 +23957,6 @@
           <w:color w:val="666666"/>
           <w:sz w:val="18"/>
           <w:szCs w:val="18"/>
-          <w:lang w:val="en-US"/>
         </w:rPr>
         <w:t xml:space="preserve"> </w:t>
       </w:r>
@@ -20750,7 +23968,6 @@
           <w:color w:val="666666"/>
           <w:sz w:val="18"/>
           <w:szCs w:val="18"/>
-          <w:lang w:val="en-US"/>
         </w:rPr>
         <w:t>aṣīlah</w:t>
       </w:r>
@@ -20760,9 +23977,6 @@
       <w:pPr>
         <w:spacing w:before="180" w:after="60"/>
         <w:jc w:val="center"/>
-        <w:rPr>
-          <w:lang w:val="en-US"/>
-        </w:rPr>
       </w:pPr>
       <w:r>
         <w:rPr>
@@ -20774,9 +23988,36 @@
           <w:color w:val="1E6FA8"/>
           <w:sz w:val="20"/>
           <w:szCs w:val="20"/>
-          <w:lang w:val="en-US"/>
-        </w:rPr>
-        <w:t>(Chorus repeats)</w:t>
+        </w:rPr>
+        <w:t xml:space="preserve">(Chorus </w:t>
+      </w:r>
+      <w:proofErr w:type="spellStart"/>
+      <w:r>
+        <w:rPr>
+          <w:rFonts w:ascii="Georgia" w:eastAsia="Georgia" w:hAnsi="Georgia" w:cs="Georgia"/>
+          <w:b/>
+          <w:bCs/>
+          <w:i/>
+          <w:iCs/>
+          <w:color w:val="1E6FA8"/>
+          <w:sz w:val="20"/>
+          <w:szCs w:val="20"/>
+        </w:rPr>
+        <w:t>repeats</w:t>
+      </w:r>
+      <w:proofErr w:type="spellEnd"/>
+      <w:r>
+        <w:rPr>
+          <w:rFonts w:ascii="Georgia" w:eastAsia="Georgia" w:hAnsi="Georgia" w:cs="Georgia"/>
+          <w:b/>
+          <w:bCs/>
+          <w:i/>
+          <w:iCs/>
+          <w:color w:val="1E6FA8"/>
+          <w:sz w:val="20"/>
+          <w:szCs w:val="20"/>
+        </w:rPr>
+        <w:t>)</w:t>
       </w:r>
     </w:p>
     <w:p>
@@ -20784,9 +24025,6 @@
         <w:bidi/>
         <w:spacing w:after="10"/>
         <w:jc w:val="center"/>
-        <w:rPr>
-          <w:lang w:val="en-US"/>
-        </w:rPr>
       </w:pPr>
       <w:r>
         <w:rPr>
@@ -20831,9 +24069,6 @@
       <w:pPr>
         <w:spacing w:after="160"/>
         <w:jc w:val="center"/>
-        <w:rPr>
-          <w:lang w:val="en-US"/>
-        </w:rPr>
       </w:pPr>
       <w:proofErr w:type="spellStart"/>
       <w:r>
@@ -20843,7 +24078,6 @@
           <w:color w:val="666666"/>
           <w:sz w:val="18"/>
           <w:szCs w:val="18"/>
-          <w:lang w:val="en-US"/>
         </w:rPr>
         <w:lastRenderedPageBreak/>
         <w:t>Hayyā</w:t>
@@ -20856,7 +24090,6 @@
           <w:color w:val="666666"/>
           <w:sz w:val="18"/>
           <w:szCs w:val="18"/>
-          <w:lang w:val="en-US"/>
         </w:rPr>
         <w:t xml:space="preserve"> </w:t>
       </w:r>
@@ -20868,7 +24101,6 @@
           <w:color w:val="666666"/>
           <w:sz w:val="18"/>
           <w:szCs w:val="18"/>
-          <w:lang w:val="en-US"/>
         </w:rPr>
         <w:t>hayyā</w:t>
       </w:r>
@@ -20880,7 +24112,6 @@
           <w:color w:val="666666"/>
           <w:sz w:val="18"/>
           <w:szCs w:val="18"/>
-          <w:lang w:val="en-US"/>
         </w:rPr>
         <w:t xml:space="preserve"> </w:t>
       </w:r>
@@ -20892,7 +24123,6 @@
           <w:color w:val="666666"/>
           <w:sz w:val="18"/>
           <w:szCs w:val="18"/>
-          <w:lang w:val="en-US"/>
         </w:rPr>
         <w:t>yā</w:t>
       </w:r>
@@ -20904,7 +24134,6 @@
           <w:color w:val="666666"/>
           <w:sz w:val="18"/>
           <w:szCs w:val="18"/>
-          <w:lang w:val="en-US"/>
         </w:rPr>
         <w:t xml:space="preserve"> </w:t>
       </w:r>
@@ -20916,7 +24145,6 @@
           <w:color w:val="666666"/>
           <w:sz w:val="18"/>
           <w:szCs w:val="18"/>
-          <w:lang w:val="en-US"/>
         </w:rPr>
         <w:t>muntakhab</w:t>
       </w:r>
@@ -20927,9 +24155,6 @@
         <w:bidi/>
         <w:spacing w:after="10"/>
         <w:jc w:val="center"/>
-        <w:rPr>
-          <w:lang w:val="en-US"/>
-        </w:rPr>
       </w:pPr>
       <w:r>
         <w:rPr>
@@ -22986,6 +26211,92 @@
 <file path=word/numbering.xml><?xml version="1.0" encoding="utf-8"?>
 <w:numbering xmlns:wpc="http://schemas.microsoft.com/office/word/2010/wordprocessingCanvas" xmlns:cx="http://schemas.microsoft.com/office/drawing/2014/chartex" xmlns:cx1="http://schemas.microsoft.com/office/drawing/2015/9/8/chartex" xmlns:cx2="http://schemas.microsoft.com/office/drawing/2015/10/21/chartex" xmlns:cx3="http://schemas.microsoft.com/office/drawing/2016/5/9/chartex" xmlns:cx4="http://schemas.microsoft.com/office/drawing/2016/5/10/chartex" xmlns:cx5="http://schemas.microsoft.com/office/drawing/2016/5/11/chartex" xmlns:cx6="http://schemas.microsoft.com/office/drawing/2016/5/12/chartex" xmlns:cx7="http://schemas.microsoft.com/office/drawing/2016/5/13/chartex" xmlns:cx8="http://schemas.microsoft.com/office/drawing/2016/5/14/chartex" xmlns:mc="http://schemas.openxmlformats.org/markup-compatibility/2006" xmlns:aink="http://schemas.microsoft.com/office/drawing/2016/ink" xmlns:am3d="http://schemas.microsoft.com/office/drawing/2017/model3d" xmlns:o="urn:schemas-microsoft-com:office:office" xmlns:r="http://schemas.openxmlformats.org/officeDocument/2006/relationships" xmlns:m="http://schemas.openxmlformats.org/officeDocument/2006/math" xmlns:v="urn:schemas-microsoft-com:vml" xmlns:wp14="http://schemas.microsoft.com/office/word/2010/wordprocessingDrawing" xmlns:wp="http://schemas.openxmlformats.org/drawingml/2006/wordprocessingDrawing" xmlns:w10="urn:schemas-microsoft-com:office:word" xmlns:w="http://schemas.openxmlformats.org/wordprocessingml/2006/main" xmlns:w14="http://schemas.microsoft.com/office/word/2010/wordml" xmlns:w15="http://schemas.microsoft.com/office/word/2012/wordml" xmlns:w16cex="http://schemas.microsoft.com/office/word/2018/wordml/cex" xmlns:w16cid="http://schemas.microsoft.com/office/word/2016/wordml/cid" xmlns:w16="http://schemas.microsoft.com/office/word/2018/wordml" xmlns:w16sdtdh="http://schemas.microsoft.com/office/word/2020/wordml/sdtdatahash" xmlns:w16se="http://schemas.microsoft.com/office/word/2015/wordml/symex" xmlns:wpg="http://schemas.microsoft.com/office/word/2010/wordprocessingGroup" xmlns:wpi="http://schemas.microsoft.com/office/word/2010/wordprocessingInk" xmlns:wne="http://schemas.microsoft.com/office/word/2006/wordml" xmlns:wps="http://schemas.microsoft.com/office/word/2010/wordprocessingShape" mc:Ignorable="w14 w15 w16se w16cid w16 w16cex w16sdtdh wp14">
   <w:abstractNum w:abstractNumId="0" w15:restartNumberingAfterBreak="0">
+    <w:nsid w:val="0CB64882"/>
+    <w:multiLevelType w:val="hybridMultilevel"/>
+    <w:tmpl w:val="ED185C2E"/>
+    <w:lvl w:ilvl="0" w:tplc="B944FBFE">
+      <w:start w:val="1"/>
+      <w:numFmt w:val="bullet"/>
+      <w:lvlText w:val="●"/>
+      <w:lvlJc w:val="left"/>
+      <w:pPr>
+        <w:ind w:left="720" w:hanging="360"/>
+      </w:pPr>
+    </w:lvl>
+    <w:lvl w:ilvl="1" w:tplc="D31089F2">
+      <w:start w:val="1"/>
+      <w:numFmt w:val="bullet"/>
+      <w:lvlText w:val="○"/>
+      <w:lvlJc w:val="left"/>
+      <w:pPr>
+        <w:ind w:left="1440" w:hanging="360"/>
+      </w:pPr>
+    </w:lvl>
+    <w:lvl w:ilvl="2" w:tplc="827AF94E">
+      <w:start w:val="1"/>
+      <w:numFmt w:val="bullet"/>
+      <w:lvlText w:val="■"/>
+      <w:lvlJc w:val="left"/>
+      <w:pPr>
+        <w:ind w:left="2160" w:hanging="360"/>
+      </w:pPr>
+    </w:lvl>
+    <w:lvl w:ilvl="3" w:tplc="BFD4BB32">
+      <w:start w:val="1"/>
+      <w:numFmt w:val="bullet"/>
+      <w:lvlText w:val="●"/>
+      <w:lvlJc w:val="left"/>
+      <w:pPr>
+        <w:ind w:left="2880" w:hanging="360"/>
+      </w:pPr>
+    </w:lvl>
+    <w:lvl w:ilvl="4" w:tplc="0B2621CE">
+      <w:start w:val="1"/>
+      <w:numFmt w:val="bullet"/>
+      <w:lvlText w:val="○"/>
+      <w:lvlJc w:val="left"/>
+      <w:pPr>
+        <w:ind w:left="3600" w:hanging="360"/>
+      </w:pPr>
+    </w:lvl>
+    <w:lvl w:ilvl="5" w:tplc="2D08E66A">
+      <w:start w:val="1"/>
+      <w:numFmt w:val="bullet"/>
+      <w:lvlText w:val="■"/>
+      <w:lvlJc w:val="left"/>
+      <w:pPr>
+        <w:ind w:left="4320" w:hanging="360"/>
+      </w:pPr>
+    </w:lvl>
+    <w:lvl w:ilvl="6" w:tplc="13528F7C">
+      <w:start w:val="1"/>
+      <w:numFmt w:val="bullet"/>
+      <w:lvlText w:val="●"/>
+      <w:lvlJc w:val="left"/>
+      <w:pPr>
+        <w:ind w:left="5040" w:hanging="360"/>
+      </w:pPr>
+    </w:lvl>
+    <w:lvl w:ilvl="7" w:tplc="EC34211E">
+      <w:start w:val="1"/>
+      <w:numFmt w:val="bullet"/>
+      <w:lvlText w:val="●"/>
+      <w:lvlJc w:val="left"/>
+      <w:pPr>
+        <w:ind w:left="5760" w:hanging="360"/>
+      </w:pPr>
+    </w:lvl>
+    <w:lvl w:ilvl="8" w:tplc="C4A4777C">
+      <w:start w:val="1"/>
+      <w:numFmt w:val="bullet"/>
+      <w:lvlText w:val="●"/>
+      <w:lvlJc w:val="left"/>
+      <w:pPr>
+        <w:ind w:left="6480" w:hanging="360"/>
+      </w:pPr>
+    </w:lvl>
+  </w:abstractNum>
+  <w:abstractNum w:abstractNumId="1" w15:restartNumberingAfterBreak="0">
     <w:nsid w:val="78FE021D"/>
     <w:multiLevelType w:val="hybridMultilevel"/>
     <w:tmpl w:val="6CB84D64"/>
@@ -23072,6 +26383,12 @@
     </w:lvl>
   </w:abstractNum>
   <w:num w:numId="1">
+    <w:abstractNumId w:val="1"/>
+    <w:lvlOverride w:ilvl="0">
+      <w:startOverride w:val="1"/>
+    </w:lvlOverride>
+  </w:num>
+  <w:num w:numId="2">
     <w:abstractNumId w:val="0"/>
     <w:lvlOverride w:ilvl="0">
       <w:startOverride w:val="1"/>

</xml_diff>